<commit_message>
Update file NO4_1_ApplicationDev...3 - 11 | S1
</commit_message>
<xml_diff>
--- a/doc/N04_1_ApplicationDevelopment_First Plan.docx
+++ b/doc/N04_1_ApplicationDevelopment_First Plan.docx
@@ -1,6 +1,6 @@
 
 <file path=word/document.xml><?xml version="1.0" encoding="utf-8"?>
-<w:document xmlns:wpc="http://schemas.microsoft.com/office/word/2010/wordprocessingCanvas" xmlns:cx="http://schemas.microsoft.com/office/drawing/2014/chartex" xmlns:cx1="http://schemas.microsoft.com/office/drawing/2015/9/8/chartex" xmlns:cx2="http://schemas.microsoft.com/office/drawing/2015/10/21/chartex" xmlns:cx3="http://schemas.microsoft.com/office/drawing/2016/5/9/chartex" xmlns:cx4="http://schemas.microsoft.com/office/drawing/2016/5/10/chartex" xmlns:cx5="http://schemas.microsoft.com/office/drawing/2016/5/11/chartex" xmlns:cx6="http://schemas.microsoft.com/office/drawing/2016/5/12/chartex" xmlns:cx7="http://schemas.microsoft.com/office/drawing/2016/5/13/chartex" xmlns:cx8="http://schemas.microsoft.com/office/drawing/2016/5/14/chartex" xmlns:mc="http://schemas.openxmlformats.org/markup-compatibility/2006" xmlns:aink="http://schemas.microsoft.com/office/drawing/2016/ink" xmlns:am3d="http://schemas.microsoft.com/office/drawing/2017/model3d" xmlns:o="urn:schemas-microsoft-com:office:office" xmlns:oel="http://schemas.microsoft.com/office/2019/extlst" xmlns:r="http://schemas.openxmlformats.org/officeDocument/2006/relationships" xmlns:m="http://schemas.openxmlformats.org/officeDocument/2006/math" xmlns:v="urn:schemas-microsoft-com:vml" xmlns:wp14="http://schemas.microsoft.com/office/word/2010/wordprocessingDrawing" xmlns:wp="http://schemas.openxmlformats.org/drawingml/2006/wordprocessingDrawing" xmlns:w10="urn:schemas-microsoft-com:office:word" xmlns:w="http://schemas.openxmlformats.org/wordprocessingml/2006/main" xmlns:w14="http://schemas.microsoft.com/office/word/2010/wordml" xmlns:w15="http://schemas.microsoft.com/office/word/2012/wordml" xmlns:w16cei="http://schemas.microsoft.com/office/word/2026/wordml/cei" xmlns:w16cex="http://schemas.microsoft.com/office/word/2018/wordml/cex" xmlns:w16cid="http://schemas.microsoft.com/office/word/2016/wordml/cid" xmlns:w16="http://schemas.microsoft.com/office/word/2018/wordml" xmlns:w16du="http://schemas.microsoft.com/office/word/2023/wordml/word16du" xmlns:w16sdtdh="http://schemas.microsoft.com/office/word/2020/wordml/sdtdatahash" xmlns:w16sdtfl="http://schemas.microsoft.com/office/word/2024/wordml/sdtformatlock" xmlns:w16se="http://schemas.microsoft.com/office/word/2015/wordml/symex" xmlns:wpg="http://schemas.microsoft.com/office/word/2010/wordprocessingGroup" xmlns:wpi="http://schemas.microsoft.com/office/word/2010/wordprocessingInk" xmlns:wne="http://schemas.microsoft.com/office/word/2006/wordml" xmlns:wps="http://schemas.microsoft.com/office/word/2010/wordprocessingShape" mc:Ignorable="w14 w15 w16se w16cid w16 w16cex w16sdtdh w16sdtfl w16du wp14">
+<w:document xmlns:wpc="http://schemas.microsoft.com/office/word/2010/wordprocessingCanvas" xmlns:cx="http://schemas.microsoft.com/office/drawing/2014/chartex" xmlns:cx1="http://schemas.microsoft.com/office/drawing/2015/9/8/chartex" xmlns:cx2="http://schemas.microsoft.com/office/drawing/2015/10/21/chartex" xmlns:cx3="http://schemas.microsoft.com/office/drawing/2016/5/9/chartex" xmlns:cx4="http://schemas.microsoft.com/office/drawing/2016/5/10/chartex" xmlns:cx5="http://schemas.microsoft.com/office/drawing/2016/5/11/chartex" xmlns:cx6="http://schemas.microsoft.com/office/drawing/2016/5/12/chartex" xmlns:cx7="http://schemas.microsoft.com/office/drawing/2016/5/13/chartex" xmlns:cx8="http://schemas.microsoft.com/office/drawing/2016/5/14/chartex" xmlns:mc="http://schemas.openxmlformats.org/markup-compatibility/2006" xmlns:aink="http://schemas.microsoft.com/office/drawing/2016/ink" xmlns:am3d="http://schemas.microsoft.com/office/drawing/2017/model3d" xmlns:o="urn:schemas-microsoft-com:office:office" xmlns:oel="http://schemas.microsoft.com/office/2019/extlst" xmlns:r="http://schemas.openxmlformats.org/officeDocument/2006/relationships" xmlns:m="http://schemas.openxmlformats.org/officeDocument/2006/math" xmlns:v="urn:schemas-microsoft-com:vml" xmlns:wp14="http://schemas.microsoft.com/office/word/2010/wordprocessingDrawing" xmlns:wp="http://schemas.openxmlformats.org/drawingml/2006/wordprocessingDrawing" xmlns:w10="urn:schemas-microsoft-com:office:word" xmlns:w="http://schemas.openxmlformats.org/wordprocessingml/2006/main" xmlns:w14="http://schemas.microsoft.com/office/word/2010/wordml" xmlns:w15="http://schemas.microsoft.com/office/word/2012/wordml" xmlns:w16cex="http://schemas.microsoft.com/office/word/2018/wordml/cex" xmlns:w16cid="http://schemas.microsoft.com/office/word/2016/wordml/cid" xmlns:w16="http://schemas.microsoft.com/office/word/2018/wordml" xmlns:w16du="http://schemas.microsoft.com/office/word/2023/wordml/word16du" xmlns:w16sdtdh="http://schemas.microsoft.com/office/word/2020/wordml/sdtdatahash" xmlns:w16sdtfl="http://schemas.microsoft.com/office/word/2024/wordml/sdtformatlock" xmlns:w16se="http://schemas.microsoft.com/office/word/2015/wordml/symex" xmlns:wpg="http://schemas.microsoft.com/office/word/2010/wordprocessingGroup" xmlns:wpi="http://schemas.microsoft.com/office/word/2010/wordprocessingInk" xmlns:wne="http://schemas.microsoft.com/office/word/2006/wordml" xmlns:wps="http://schemas.microsoft.com/office/word/2010/wordprocessingShape" mc:Ignorable="w14 w15 w16se w16cid w16 w16cex w16sdtdh w16sdtfl w16du wp14">
   <w:body>
     <w:p>
       <w:pPr>
@@ -113,8 +113,18 @@
           <w:sz w:val="26"/>
           <w:szCs w:val="26"/>
         </w:rPr>
-        <w:t>- Thành viên nhóm :</w:t>
+        <w:t xml:space="preserve">- Thành viên </w:t>
       </w:r>
+      <w:proofErr w:type="gramStart"/>
+      <w:r>
+        <w:rPr>
+          <w:rFonts w:ascii="Times New Roman" w:hAnsi="Times New Roman" w:cs="Times New Roman"/>
+          <w:sz w:val="26"/>
+          <w:szCs w:val="26"/>
+        </w:rPr>
+        <w:t>nhóm :</w:t>
+      </w:r>
+      <w:proofErr w:type="gramEnd"/>
     </w:p>
     <w:p>
       <w:pPr>
@@ -5927,6 +5937,32 @@
               </w:rPr>
             </w:pPr>
           </w:p>
+          <w:p>
+            <w:pPr>
+              <w:rPr>
+                <w:rFonts w:ascii="Times New Roman" w:hAnsi="Times New Roman" w:cs="Times New Roman"/>
+                <w:sz w:val="26"/>
+                <w:szCs w:val="26"/>
+              </w:rPr>
+            </w:pPr>
+            <w:r>
+              <w:rPr>
+                <w:rFonts w:ascii="Times New Roman" w:hAnsi="Times New Roman" w:cs="Times New Roman"/>
+                <w:sz w:val="26"/>
+                <w:szCs w:val="26"/>
+              </w:rPr>
+              <w:t>Phân tích hệ thống: Vẽ Use Case diagram và viết Đặc tả Use Case cho toàn bộ hệ thống.</w:t>
+            </w:r>
+          </w:p>
+          <w:p>
+            <w:pPr>
+              <w:rPr>
+                <w:rFonts w:ascii="Times New Roman" w:hAnsi="Times New Roman" w:cs="Times New Roman"/>
+                <w:sz w:val="26"/>
+                <w:szCs w:val="26"/>
+              </w:rPr>
+            </w:pPr>
+          </w:p>
         </w:tc>
         <w:tc>
           <w:tcPr>
@@ -5944,6 +5980,14 @@
                 <w:szCs w:val="26"/>
               </w:rPr>
             </w:pPr>
+            <w:r>
+              <w:rPr>
+                <w:rFonts w:ascii="Times New Roman" w:hAnsi="Times New Roman" w:cs="Times New Roman"/>
+                <w:sz w:val="26"/>
+                <w:szCs w:val="26"/>
+              </w:rPr>
+              <w:t>Tất cả thành viên</w:t>
+            </w:r>
           </w:p>
         </w:tc>
         <w:tc>
@@ -5961,6 +6005,36 @@
                 <w:szCs w:val="26"/>
               </w:rPr>
             </w:pPr>
+          </w:p>
+          <w:p>
+            <w:pPr>
+              <w:jc w:val="center"/>
+              <w:rPr>
+                <w:rFonts w:ascii="Times New Roman" w:hAnsi="Times New Roman" w:cs="Times New Roman"/>
+                <w:bCs/>
+                <w:sz w:val="26"/>
+                <w:szCs w:val="26"/>
+              </w:rPr>
+            </w:pPr>
+          </w:p>
+          <w:p>
+            <w:pPr>
+              <w:jc w:val="center"/>
+              <w:rPr>
+                <w:rFonts w:ascii="Times New Roman" w:hAnsi="Times New Roman" w:cs="Times New Roman"/>
+                <w:sz w:val="26"/>
+                <w:szCs w:val="26"/>
+              </w:rPr>
+            </w:pPr>
+            <w:r>
+              <w:rPr>
+                <w:rFonts w:ascii="Times New Roman" w:hAnsi="Times New Roman" w:cs="Times New Roman"/>
+                <w:bCs/>
+                <w:sz w:val="26"/>
+                <w:szCs w:val="26"/>
+              </w:rPr>
+              <w:t>100%</w:t>
+            </w:r>
           </w:p>
         </w:tc>
         <w:tc>
@@ -6037,6 +6111,49 @@
               </w:rPr>
             </w:pPr>
           </w:p>
+          <w:p>
+            <w:pPr>
+              <w:rPr>
+                <w:rFonts w:ascii="Times New Roman" w:hAnsi="Times New Roman" w:cs="Times New Roman"/>
+                <w:sz w:val="26"/>
+                <w:szCs w:val="26"/>
+              </w:rPr>
+            </w:pPr>
+            <w:r>
+              <w:rPr>
+                <w:rFonts w:ascii="Times New Roman" w:hAnsi="Times New Roman" w:cs="Times New Roman"/>
+                <w:sz w:val="26"/>
+                <w:szCs w:val="26"/>
+              </w:rPr>
+              <w:t xml:space="preserve">Thiết kế Class diagram, Activity diagram, Sequence diagram cho </w:t>
+            </w:r>
+          </w:p>
+          <w:p>
+            <w:pPr>
+              <w:rPr>
+                <w:rFonts w:ascii="Times New Roman" w:hAnsi="Times New Roman" w:cs="Times New Roman"/>
+                <w:sz w:val="26"/>
+                <w:szCs w:val="26"/>
+              </w:rPr>
+            </w:pPr>
+            <w:r>
+              <w:rPr>
+                <w:rFonts w:ascii="Times New Roman" w:hAnsi="Times New Roman" w:cs="Times New Roman"/>
+                <w:sz w:val="26"/>
+                <w:szCs w:val="26"/>
+              </w:rPr>
+              <w:t>các luồng nghiệp vụ chính.</w:t>
+            </w:r>
+          </w:p>
+          <w:p>
+            <w:pPr>
+              <w:rPr>
+                <w:rFonts w:ascii="Times New Roman" w:hAnsi="Times New Roman" w:cs="Times New Roman"/>
+                <w:sz w:val="26"/>
+                <w:szCs w:val="26"/>
+              </w:rPr>
+            </w:pPr>
+          </w:p>
         </w:tc>
         <w:tc>
           <w:tcPr>
@@ -6055,6 +6172,65 @@
                 <w:szCs w:val="26"/>
               </w:rPr>
             </w:pPr>
+            <w:r>
+              <w:rPr>
+                <w:rFonts w:ascii="Times New Roman" w:hAnsi="Times New Roman" w:cs="Times New Roman"/>
+                <w:sz w:val="26"/>
+                <w:szCs w:val="26"/>
+              </w:rPr>
+              <w:t>Nguyễn Minh Thuận</w:t>
+            </w:r>
+          </w:p>
+          <w:p>
+            <w:pPr>
+              <w:rPr>
+                <w:rFonts w:ascii="Times New Roman" w:hAnsi="Times New Roman" w:cs="Times New Roman"/>
+                <w:sz w:val="26"/>
+                <w:szCs w:val="26"/>
+              </w:rPr>
+            </w:pPr>
+            <w:r>
+              <w:rPr>
+                <w:rFonts w:ascii="Times New Roman" w:hAnsi="Times New Roman" w:cs="Times New Roman"/>
+                <w:sz w:val="26"/>
+                <w:szCs w:val="26"/>
+              </w:rPr>
+              <w:t>Lê Trần Quang Thanh</w:t>
+            </w:r>
+          </w:p>
+          <w:p>
+            <w:pPr>
+              <w:rPr>
+                <w:rFonts w:ascii="Times New Roman" w:hAnsi="Times New Roman" w:cs="Times New Roman"/>
+                <w:sz w:val="26"/>
+                <w:szCs w:val="26"/>
+              </w:rPr>
+            </w:pPr>
+            <w:r>
+              <w:rPr>
+                <w:rFonts w:ascii="Times New Roman" w:hAnsi="Times New Roman" w:cs="Times New Roman"/>
+                <w:sz w:val="26"/>
+                <w:szCs w:val="26"/>
+              </w:rPr>
+              <w:t>Nguyễn Minh Lý</w:t>
+            </w:r>
+          </w:p>
+          <w:p>
+            <w:pPr>
+              <w:rPr>
+                <w:rFonts w:ascii="Times New Roman" w:hAnsi="Times New Roman" w:cs="Times New Roman"/>
+                <w:sz w:val="26"/>
+                <w:szCs w:val="26"/>
+              </w:rPr>
+            </w:pPr>
+            <w:r>
+              <w:rPr>
+                <w:rFonts w:ascii="Times New Roman" w:hAnsi="Times New Roman" w:cs="Times New Roman"/>
+                <w:sz w:val="26"/>
+                <w:szCs w:val="26"/>
+              </w:rPr>
+              <w:t>Hồ Văn Khánh</w:t>
+            </w:r>
           </w:p>
         </w:tc>
         <w:tc>
@@ -6065,6 +6241,56 @@
               <w:bottom w:val="dotted" w:sz="4" w:space="0" w:color="auto"/>
             </w:tcBorders>
           </w:tcPr>
+          <w:p>
+            <w:pPr>
+              <w:jc w:val="center"/>
+              <w:rPr>
+                <w:rFonts w:ascii="Times New Roman" w:hAnsi="Times New Roman" w:cs="Times New Roman"/>
+                <w:bCs/>
+                <w:sz w:val="26"/>
+                <w:szCs w:val="26"/>
+              </w:rPr>
+            </w:pPr>
+          </w:p>
+          <w:p>
+            <w:pPr>
+              <w:rPr>
+                <w:rFonts w:ascii="Times New Roman" w:hAnsi="Times New Roman" w:cs="Times New Roman"/>
+                <w:bCs/>
+                <w:sz w:val="26"/>
+                <w:szCs w:val="26"/>
+              </w:rPr>
+            </w:pPr>
+            <w:r>
+              <w:rPr>
+                <w:rFonts w:ascii="Times New Roman" w:hAnsi="Times New Roman" w:cs="Times New Roman"/>
+                <w:bCs/>
+                <w:sz w:val="26"/>
+                <w:szCs w:val="26"/>
+              </w:rPr>
+              <w:t xml:space="preserve"> </w:t>
+            </w:r>
+          </w:p>
+          <w:p>
+            <w:pPr>
+              <w:jc w:val="center"/>
+              <w:rPr>
+                <w:rFonts w:ascii="Times New Roman" w:hAnsi="Times New Roman" w:cs="Times New Roman"/>
+                <w:bCs/>
+                <w:sz w:val="26"/>
+                <w:szCs w:val="26"/>
+              </w:rPr>
+            </w:pPr>
+            <w:r>
+              <w:rPr>
+                <w:rFonts w:ascii="Times New Roman" w:hAnsi="Times New Roman" w:cs="Times New Roman"/>
+                <w:bCs/>
+                <w:sz w:val="26"/>
+                <w:szCs w:val="26"/>
+              </w:rPr>
+              <w:t>100%</w:t>
+            </w:r>
+          </w:p>
           <w:p>
             <w:pPr>
               <w:rPr>
@@ -7424,7 +7650,23 @@
                 <w:sz w:val="26"/>
                 <w:szCs w:val="26"/>
               </w:rPr>
-              <w:t>:  ../../20</w:t>
+              <w:t xml:space="preserve">:  </w:t>
+            </w:r>
+            <w:r>
+              <w:rPr>
+                <w:rFonts w:ascii="Times New Roman" w:hAnsi="Times New Roman" w:cs="Times New Roman"/>
+                <w:sz w:val="26"/>
+                <w:szCs w:val="26"/>
+              </w:rPr>
+              <w:t>31/08</w:t>
+            </w:r>
+            <w:r>
+              <w:rPr>
+                <w:rFonts w:ascii="Times New Roman" w:hAnsi="Times New Roman" w:cs="Times New Roman"/>
+                <w:sz w:val="26"/>
+                <w:szCs w:val="26"/>
+              </w:rPr>
+              <w:t>/20</w:t>
             </w:r>
             <w:r>
               <w:rPr>
@@ -7449,15 +7691,44 @@
                 <w:sz w:val="26"/>
                 <w:szCs w:val="26"/>
               </w:rPr>
-              <w:t xml:space="preserve">Đến:  </w:t>
-            </w:r>
-            <w:r>
-              <w:rPr>
-                <w:rFonts w:ascii="Times New Roman" w:hAnsi="Times New Roman" w:cs="Times New Roman"/>
-                <w:sz w:val="26"/>
-                <w:szCs w:val="26"/>
-              </w:rPr>
-              <w:t>../../20</w:t>
+              <w:t>Đến:</w:t>
+            </w:r>
+            <w:proofErr w:type="gramStart"/>
+            <w:r>
+              <w:rPr>
+                <w:rFonts w:ascii="Times New Roman" w:hAnsi="Times New Roman" w:cs="Times New Roman"/>
+                <w:sz w:val="26"/>
+                <w:szCs w:val="26"/>
+              </w:rPr>
+              <w:t xml:space="preserve">  </w:t>
+            </w:r>
+            <w:r>
+              <w:rPr>
+                <w:rFonts w:ascii="Times New Roman" w:hAnsi="Times New Roman" w:cs="Times New Roman"/>
+                <w:sz w:val="26"/>
+                <w:szCs w:val="26"/>
+              </w:rPr>
+              <w:t>.</w:t>
+            </w:r>
+            <w:proofErr w:type="gramEnd"/>
+            <w:r>
+              <w:t xml:space="preserve"> </w:t>
+            </w:r>
+            <w:r>
+              <w:rPr>
+                <w:rFonts w:ascii="Times New Roman" w:hAnsi="Times New Roman" w:cs="Times New Roman"/>
+                <w:sz w:val="26"/>
+                <w:szCs w:val="26"/>
+              </w:rPr>
+              <w:t>06/09</w:t>
+            </w:r>
+            <w:r>
+              <w:rPr>
+                <w:rFonts w:ascii="Times New Roman" w:hAnsi="Times New Roman" w:cs="Times New Roman"/>
+                <w:sz w:val="26"/>
+                <w:szCs w:val="26"/>
+              </w:rPr>
+              <w:t>/20</w:t>
             </w:r>
             <w:r>
               <w:rPr>
@@ -7494,6 +7765,32 @@
               </w:rPr>
             </w:pPr>
           </w:p>
+          <w:p>
+            <w:pPr>
+              <w:rPr>
+                <w:rFonts w:ascii="Times New Roman" w:hAnsi="Times New Roman" w:cs="Times New Roman"/>
+                <w:sz w:val="26"/>
+                <w:szCs w:val="26"/>
+              </w:rPr>
+            </w:pPr>
+            <w:r>
+              <w:rPr>
+                <w:rFonts w:ascii="Times New Roman" w:hAnsi="Times New Roman" w:cs="Times New Roman"/>
+                <w:sz w:val="26"/>
+                <w:szCs w:val="26"/>
+              </w:rPr>
+              <w:t>Thiết kế Cơ sở dữ liệu: Vẽ sơ đồ ERD, định nghĩa các thực thể (Entity) và thuộc tính, thiết lập các ràng buộc (Constraints).</w:t>
+            </w:r>
+          </w:p>
+          <w:p>
+            <w:pPr>
+              <w:rPr>
+                <w:rFonts w:ascii="Times New Roman" w:hAnsi="Times New Roman" w:cs="Times New Roman"/>
+                <w:sz w:val="26"/>
+                <w:szCs w:val="26"/>
+              </w:rPr>
+            </w:pPr>
+          </w:p>
         </w:tc>
         <w:tc>
           <w:tcPr>
@@ -7511,6 +7808,40 @@
                 <w:szCs w:val="26"/>
               </w:rPr>
             </w:pPr>
+            <w:r>
+              <w:rPr>
+                <w:rFonts w:ascii="Times New Roman" w:hAnsi="Times New Roman" w:cs="Times New Roman"/>
+                <w:sz w:val="26"/>
+                <w:szCs w:val="26"/>
+              </w:rPr>
+              <w:t>Nguyễn Minh Lý</w:t>
+            </w:r>
+          </w:p>
+          <w:p>
+            <w:pPr>
+              <w:rPr>
+                <w:rFonts w:ascii="Times New Roman" w:hAnsi="Times New Roman" w:cs="Times New Roman"/>
+                <w:sz w:val="26"/>
+                <w:szCs w:val="26"/>
+              </w:rPr>
+            </w:pPr>
+          </w:p>
+          <w:p>
+            <w:pPr>
+              <w:rPr>
+                <w:rFonts w:ascii="Times New Roman" w:hAnsi="Times New Roman" w:cs="Times New Roman"/>
+                <w:sz w:val="26"/>
+                <w:szCs w:val="26"/>
+              </w:rPr>
+            </w:pPr>
+            <w:r>
+              <w:rPr>
+                <w:rFonts w:ascii="Times New Roman" w:hAnsi="Times New Roman" w:cs="Times New Roman"/>
+                <w:sz w:val="26"/>
+                <w:szCs w:val="26"/>
+              </w:rPr>
+              <w:t>Hồ Văn Khánh</w:t>
+            </w:r>
           </w:p>
         </w:tc>
         <w:tc>
@@ -7604,6 +7935,32 @@
               </w:rPr>
             </w:pPr>
           </w:p>
+          <w:p>
+            <w:pPr>
+              <w:rPr>
+                <w:rFonts w:ascii="Times New Roman" w:hAnsi="Times New Roman" w:cs="Times New Roman"/>
+                <w:sz w:val="26"/>
+                <w:szCs w:val="26"/>
+              </w:rPr>
+            </w:pPr>
+            <w:r>
+              <w:rPr>
+                <w:rFonts w:ascii="Times New Roman" w:hAnsi="Times New Roman" w:cs="Times New Roman"/>
+                <w:sz w:val="26"/>
+                <w:szCs w:val="26"/>
+              </w:rPr>
+              <w:t>Thiết kế giao diện (UI/UX): Lên ý tưởng và vẽ Prototype/Mockup trên Figma cho các màn hình của phần mềm.</w:t>
+            </w:r>
+          </w:p>
+          <w:p>
+            <w:pPr>
+              <w:rPr>
+                <w:rFonts w:ascii="Times New Roman" w:hAnsi="Times New Roman" w:cs="Times New Roman"/>
+                <w:sz w:val="26"/>
+                <w:szCs w:val="26"/>
+              </w:rPr>
+            </w:pPr>
+          </w:p>
         </w:tc>
         <w:tc>
           <w:tcPr>
@@ -7622,6 +7979,75 @@
                 <w:szCs w:val="26"/>
               </w:rPr>
             </w:pPr>
+            <w:r>
+              <w:rPr>
+                <w:rFonts w:ascii="Times New Roman" w:hAnsi="Times New Roman" w:cs="Times New Roman"/>
+                <w:sz w:val="26"/>
+                <w:szCs w:val="26"/>
+              </w:rPr>
+              <w:t>Nguyễn Minh Thuận</w:t>
+            </w:r>
+          </w:p>
+          <w:p>
+            <w:pPr>
+              <w:rPr>
+                <w:rFonts w:ascii="Times New Roman" w:hAnsi="Times New Roman" w:cs="Times New Roman"/>
+                <w:sz w:val="26"/>
+                <w:szCs w:val="26"/>
+              </w:rPr>
+            </w:pPr>
+          </w:p>
+          <w:p>
+            <w:pPr>
+              <w:rPr>
+                <w:rFonts w:ascii="Times New Roman" w:hAnsi="Times New Roman" w:cs="Times New Roman"/>
+                <w:sz w:val="26"/>
+                <w:szCs w:val="26"/>
+              </w:rPr>
+            </w:pPr>
+            <w:r>
+              <w:rPr>
+                <w:rFonts w:ascii="Times New Roman" w:hAnsi="Times New Roman" w:cs="Times New Roman"/>
+                <w:sz w:val="26"/>
+                <w:szCs w:val="26"/>
+              </w:rPr>
+              <w:t>Nguyễn Khắc Duy</w:t>
+            </w:r>
+          </w:p>
+          <w:p>
+            <w:pPr>
+              <w:rPr>
+                <w:rFonts w:ascii="Times New Roman" w:hAnsi="Times New Roman" w:cs="Times New Roman"/>
+                <w:sz w:val="26"/>
+                <w:szCs w:val="26"/>
+              </w:rPr>
+            </w:pPr>
+          </w:p>
+          <w:p>
+            <w:pPr>
+              <w:rPr>
+                <w:rFonts w:ascii="Times New Roman" w:hAnsi="Times New Roman" w:cs="Times New Roman"/>
+                <w:sz w:val="26"/>
+                <w:szCs w:val="26"/>
+              </w:rPr>
+            </w:pPr>
+            <w:r>
+              <w:rPr>
+                <w:rFonts w:ascii="Times New Roman" w:hAnsi="Times New Roman" w:cs="Times New Roman"/>
+                <w:sz w:val="26"/>
+                <w:szCs w:val="26"/>
+              </w:rPr>
+              <w:t>Lê Trần Quang Thanh</w:t>
+            </w:r>
+          </w:p>
+          <w:p>
+            <w:pPr>
+              <w:rPr>
+                <w:rFonts w:ascii="Times New Roman" w:hAnsi="Times New Roman" w:cs="Times New Roman"/>
+                <w:sz w:val="26"/>
+                <w:szCs w:val="26"/>
+              </w:rPr>
+            </w:pPr>
           </w:p>
         </w:tc>
         <w:tc>
@@ -7641,6 +8067,44 @@
               </w:rPr>
             </w:pPr>
           </w:p>
+          <w:p>
+            <w:pPr>
+              <w:rPr>
+                <w:rFonts w:ascii="Times New Roman" w:hAnsi="Times New Roman" w:cs="Times New Roman"/>
+                <w:sz w:val="26"/>
+                <w:szCs w:val="26"/>
+              </w:rPr>
+            </w:pPr>
+          </w:p>
+          <w:p>
+            <w:pPr>
+              <w:jc w:val="center"/>
+              <w:rPr>
+                <w:rFonts w:ascii="Times New Roman" w:hAnsi="Times New Roman" w:cs="Times New Roman"/>
+                <w:bCs/>
+                <w:sz w:val="26"/>
+                <w:szCs w:val="26"/>
+              </w:rPr>
+            </w:pPr>
+            <w:r>
+              <w:rPr>
+                <w:rFonts w:ascii="Times New Roman" w:hAnsi="Times New Roman" w:cs="Times New Roman"/>
+                <w:bCs/>
+                <w:sz w:val="26"/>
+                <w:szCs w:val="26"/>
+              </w:rPr>
+              <w:t>100%</w:t>
+            </w:r>
+          </w:p>
+          <w:p>
+            <w:pPr>
+              <w:rPr>
+                <w:rFonts w:ascii="Times New Roman" w:hAnsi="Times New Roman" w:cs="Times New Roman"/>
+                <w:sz w:val="26"/>
+                <w:szCs w:val="26"/>
+              </w:rPr>
+            </w:pPr>
+          </w:p>
         </w:tc>
         <w:tc>
           <w:tcPr>
@@ -7676,6 +8140,14 @@
                 <w:szCs w:val="26"/>
               </w:rPr>
             </w:pPr>
+            <w:r>
+              <w:rPr>
+                <w:rFonts w:ascii="Times New Roman" w:hAnsi="Times New Roman" w:cs="Times New Roman"/>
+                <w:sz w:val="26"/>
+                <w:szCs w:val="26"/>
+              </w:rPr>
+              <w:t>Đảm bảo nguyên tắc phân cấp thị giác</w:t>
+            </w:r>
           </w:p>
         </w:tc>
       </w:tr>
@@ -8991,7 +9463,23 @@
                 <w:sz w:val="26"/>
                 <w:szCs w:val="26"/>
               </w:rPr>
-              <w:t>:  ../../20</w:t>
+              <w:t xml:space="preserve">:  </w:t>
+            </w:r>
+            <w:r>
+              <w:rPr>
+                <w:rFonts w:ascii="Times New Roman" w:hAnsi="Times New Roman" w:cs="Times New Roman"/>
+                <w:sz w:val="26"/>
+                <w:szCs w:val="26"/>
+              </w:rPr>
+              <w:t>07/09</w:t>
+            </w:r>
+            <w:r>
+              <w:rPr>
+                <w:rFonts w:ascii="Times New Roman" w:hAnsi="Times New Roman" w:cs="Times New Roman"/>
+                <w:sz w:val="26"/>
+                <w:szCs w:val="26"/>
+              </w:rPr>
+              <w:t>/20</w:t>
             </w:r>
             <w:r>
               <w:rPr>
@@ -9024,7 +9512,15 @@
                 <w:sz w:val="26"/>
                 <w:szCs w:val="26"/>
               </w:rPr>
-              <w:t>../../20</w:t>
+              <w:t>13/09</w:t>
+            </w:r>
+            <w:r>
+              <w:rPr>
+                <w:rFonts w:ascii="Times New Roman" w:hAnsi="Times New Roman" w:cs="Times New Roman"/>
+                <w:sz w:val="26"/>
+                <w:szCs w:val="26"/>
+              </w:rPr>
+              <w:t>/20</w:t>
             </w:r>
             <w:r>
               <w:rPr>
@@ -9060,6 +9556,31 @@
                 <w:szCs w:val="26"/>
               </w:rPr>
             </w:pPr>
+            <w:r>
+              <w:rPr>
+                <w:rFonts w:ascii="Times New Roman" w:hAnsi="Times New Roman" w:cs="Times New Roman"/>
+                <w:sz w:val="26"/>
+                <w:szCs w:val="26"/>
+              </w:rPr>
+              <w:t>Viết script SQL tạo Database, các bảng, khóa chính/khóa ngoại</w:t>
+            </w:r>
+            <w:r>
+              <w:rPr>
+                <w:rFonts w:ascii="Times New Roman" w:hAnsi="Times New Roman" w:cs="Times New Roman"/>
+                <w:sz w:val="26"/>
+                <w:szCs w:val="26"/>
+              </w:rPr>
+              <w:t>.</w:t>
+            </w:r>
+          </w:p>
+          <w:p>
+            <w:pPr>
+              <w:rPr>
+                <w:rFonts w:ascii="Times New Roman" w:hAnsi="Times New Roman" w:cs="Times New Roman"/>
+                <w:sz w:val="26"/>
+                <w:szCs w:val="26"/>
+              </w:rPr>
+            </w:pPr>
           </w:p>
         </w:tc>
         <w:tc>
@@ -9078,6 +9599,23 @@
                 <w:szCs w:val="26"/>
               </w:rPr>
             </w:pPr>
+            <w:r>
+              <w:rPr>
+                <w:rFonts w:ascii="Times New Roman" w:hAnsi="Times New Roman" w:cs="Times New Roman"/>
+                <w:sz w:val="26"/>
+                <w:szCs w:val="26"/>
+              </w:rPr>
+              <w:t>Nguyễn Minh Thuận</w:t>
+            </w:r>
+          </w:p>
+          <w:p>
+            <w:pPr>
+              <w:rPr>
+                <w:rFonts w:ascii="Times New Roman" w:hAnsi="Times New Roman" w:cs="Times New Roman"/>
+                <w:sz w:val="26"/>
+                <w:szCs w:val="26"/>
+              </w:rPr>
+            </w:pPr>
           </w:p>
         </w:tc>
         <w:tc>
@@ -9087,6 +9625,37 @@
               <w:bottom w:val="dotted" w:sz="4" w:space="0" w:color="auto"/>
             </w:tcBorders>
           </w:tcPr>
+          <w:p>
+            <w:pPr>
+              <w:jc w:val="center"/>
+              <w:rPr>
+                <w:rFonts w:ascii="Times New Roman" w:hAnsi="Times New Roman" w:cs="Times New Roman"/>
+                <w:bCs/>
+                <w:sz w:val="26"/>
+                <w:szCs w:val="26"/>
+              </w:rPr>
+            </w:pPr>
+          </w:p>
+          <w:p>
+            <w:pPr>
+              <w:jc w:val="center"/>
+              <w:rPr>
+                <w:rFonts w:ascii="Times New Roman" w:hAnsi="Times New Roman" w:cs="Times New Roman"/>
+                <w:bCs/>
+                <w:sz w:val="26"/>
+                <w:szCs w:val="26"/>
+              </w:rPr>
+            </w:pPr>
+            <w:r>
+              <w:rPr>
+                <w:rFonts w:ascii="Times New Roman" w:hAnsi="Times New Roman" w:cs="Times New Roman"/>
+                <w:bCs/>
+                <w:sz w:val="26"/>
+                <w:szCs w:val="26"/>
+              </w:rPr>
+              <w:t>100%</w:t>
+            </w:r>
+          </w:p>
           <w:p>
             <w:pPr>
               <w:rPr>
@@ -9171,6 +9740,23 @@
               </w:rPr>
             </w:pPr>
           </w:p>
+          <w:p>
+            <w:pPr>
+              <w:rPr>
+                <w:rFonts w:ascii="Times New Roman" w:hAnsi="Times New Roman" w:cs="Times New Roman"/>
+                <w:sz w:val="26"/>
+                <w:szCs w:val="26"/>
+              </w:rPr>
+            </w:pPr>
+            <w:r>
+              <w:rPr>
+                <w:rFonts w:ascii="Times New Roman" w:hAnsi="Times New Roman" w:cs="Times New Roman"/>
+                <w:sz w:val="26"/>
+                <w:szCs w:val="26"/>
+              </w:rPr>
+              <w:t>Thiết lập cấu trúc Project: Tạo repository GitHub, cấu hình kết nối Database, khởi tạo các lớp Entity, DAO cơ bản.</w:t>
+            </w:r>
+          </w:p>
         </w:tc>
         <w:tc>
           <w:tcPr>
@@ -9189,6 +9775,14 @@
                 <w:szCs w:val="26"/>
               </w:rPr>
             </w:pPr>
+            <w:r>
+              <w:rPr>
+                <w:rFonts w:ascii="Times New Roman" w:hAnsi="Times New Roman" w:cs="Times New Roman"/>
+                <w:sz w:val="26"/>
+                <w:szCs w:val="26"/>
+              </w:rPr>
+              <w:t>Tất cả thành viên</w:t>
+            </w:r>
           </w:p>
         </w:tc>
         <w:tc>
@@ -9208,6 +9802,44 @@
               </w:rPr>
             </w:pPr>
           </w:p>
+          <w:p>
+            <w:pPr>
+              <w:rPr>
+                <w:rFonts w:ascii="Times New Roman" w:hAnsi="Times New Roman" w:cs="Times New Roman"/>
+                <w:sz w:val="26"/>
+                <w:szCs w:val="26"/>
+              </w:rPr>
+            </w:pPr>
+          </w:p>
+          <w:p>
+            <w:pPr>
+              <w:jc w:val="center"/>
+              <w:rPr>
+                <w:rFonts w:ascii="Times New Roman" w:hAnsi="Times New Roman" w:cs="Times New Roman"/>
+                <w:bCs/>
+                <w:sz w:val="26"/>
+                <w:szCs w:val="26"/>
+              </w:rPr>
+            </w:pPr>
+            <w:r>
+              <w:rPr>
+                <w:rFonts w:ascii="Times New Roman" w:hAnsi="Times New Roman" w:cs="Times New Roman"/>
+                <w:bCs/>
+                <w:sz w:val="26"/>
+                <w:szCs w:val="26"/>
+              </w:rPr>
+              <w:t>100%</w:t>
+            </w:r>
+          </w:p>
+          <w:p>
+            <w:pPr>
+              <w:rPr>
+                <w:rFonts w:ascii="Times New Roman" w:hAnsi="Times New Roman" w:cs="Times New Roman"/>
+                <w:sz w:val="26"/>
+                <w:szCs w:val="26"/>
+              </w:rPr>
+            </w:pPr>
+          </w:p>
         </w:tc>
         <w:tc>
           <w:tcPr>
@@ -9243,6 +9875,14 @@
                 <w:szCs w:val="26"/>
               </w:rPr>
             </w:pPr>
+            <w:r>
+              <w:rPr>
+                <w:rFonts w:ascii="Times New Roman" w:hAnsi="Times New Roman" w:cs="Times New Roman"/>
+                <w:sz w:val="26"/>
+                <w:szCs w:val="26"/>
+              </w:rPr>
+              <w:t>Áp dụng cấu trúc chuẩn mực</w:t>
+            </w:r>
           </w:p>
         </w:tc>
       </w:tr>
@@ -9284,6 +9924,14 @@
                 <w:szCs w:val="26"/>
               </w:rPr>
             </w:pPr>
+            <w:r>
+              <w:rPr>
+                <w:rFonts w:ascii="Times New Roman" w:hAnsi="Times New Roman" w:cs="Times New Roman"/>
+                <w:sz w:val="26"/>
+                <w:szCs w:val="26"/>
+              </w:rPr>
+              <w:t>Phân chia task lập trình, setup môi trường làm việc đồng bộ cho cả nhóm.</w:t>
+            </w:r>
           </w:p>
         </w:tc>
         <w:tc>
@@ -9303,6 +9951,49 @@
                 <w:szCs w:val="26"/>
               </w:rPr>
             </w:pPr>
+            <w:r>
+              <w:rPr>
+                <w:rFonts w:ascii="Times New Roman" w:hAnsi="Times New Roman" w:cs="Times New Roman"/>
+                <w:sz w:val="26"/>
+                <w:szCs w:val="26"/>
+              </w:rPr>
+              <w:t>Nguyễn Minh Thuận</w:t>
+            </w:r>
+          </w:p>
+          <w:p>
+            <w:pPr>
+              <w:rPr>
+                <w:rFonts w:ascii="Times New Roman" w:hAnsi="Times New Roman" w:cs="Times New Roman"/>
+                <w:sz w:val="26"/>
+                <w:szCs w:val="26"/>
+              </w:rPr>
+            </w:pPr>
+          </w:p>
+          <w:p>
+            <w:pPr>
+              <w:rPr>
+                <w:rFonts w:ascii="Times New Roman" w:hAnsi="Times New Roman" w:cs="Times New Roman"/>
+                <w:sz w:val="26"/>
+                <w:szCs w:val="26"/>
+              </w:rPr>
+            </w:pPr>
+            <w:r>
+              <w:rPr>
+                <w:rFonts w:ascii="Times New Roman" w:hAnsi="Times New Roman" w:cs="Times New Roman"/>
+                <w:sz w:val="26"/>
+                <w:szCs w:val="26"/>
+              </w:rPr>
+              <w:t>Lê Trần Quang Thanh</w:t>
+            </w:r>
+          </w:p>
+          <w:p>
+            <w:pPr>
+              <w:rPr>
+                <w:rFonts w:ascii="Times New Roman" w:hAnsi="Times New Roman" w:cs="Times New Roman"/>
+                <w:sz w:val="26"/>
+                <w:szCs w:val="26"/>
+              </w:rPr>
+            </w:pPr>
           </w:p>
         </w:tc>
         <w:tc>
@@ -9313,6 +10004,35 @@
               <w:bottom w:val="dotted" w:sz="4" w:space="0" w:color="auto"/>
             </w:tcBorders>
           </w:tcPr>
+          <w:p>
+            <w:pPr>
+              <w:rPr>
+                <w:rFonts w:ascii="Times New Roman" w:hAnsi="Times New Roman" w:cs="Times New Roman"/>
+                <w:sz w:val="26"/>
+                <w:szCs w:val="26"/>
+              </w:rPr>
+            </w:pPr>
+          </w:p>
+          <w:p>
+            <w:pPr>
+              <w:jc w:val="center"/>
+              <w:rPr>
+                <w:rFonts w:ascii="Times New Roman" w:hAnsi="Times New Roman" w:cs="Times New Roman"/>
+                <w:bCs/>
+                <w:sz w:val="26"/>
+                <w:szCs w:val="26"/>
+              </w:rPr>
+            </w:pPr>
+            <w:r>
+              <w:rPr>
+                <w:rFonts w:ascii="Times New Roman" w:hAnsi="Times New Roman" w:cs="Times New Roman"/>
+                <w:bCs/>
+                <w:sz w:val="26"/>
+                <w:szCs w:val="26"/>
+              </w:rPr>
+              <w:t>100%</w:t>
+            </w:r>
+          </w:p>
           <w:p>
             <w:pPr>
               <w:rPr>
@@ -10664,6 +11384,7 @@
                 <w:sz w:val="26"/>
                 <w:szCs w:val="26"/>
               </w:rPr>
+              <w:lastRenderedPageBreak/>
               <w:t>(Từ</w:t>
             </w:r>
             <w:r>
@@ -10672,7 +11393,23 @@
                 <w:sz w:val="26"/>
                 <w:szCs w:val="26"/>
               </w:rPr>
-              <w:t>:  ../../20</w:t>
+              <w:t xml:space="preserve">:  </w:t>
+            </w:r>
+            <w:r>
+              <w:rPr>
+                <w:rFonts w:ascii="Times New Roman" w:hAnsi="Times New Roman" w:cs="Times New Roman"/>
+                <w:sz w:val="26"/>
+                <w:szCs w:val="26"/>
+              </w:rPr>
+              <w:t>14/09</w:t>
+            </w:r>
+            <w:r>
+              <w:rPr>
+                <w:rFonts w:ascii="Times New Roman" w:hAnsi="Times New Roman" w:cs="Times New Roman"/>
+                <w:sz w:val="26"/>
+                <w:szCs w:val="26"/>
+              </w:rPr>
+              <w:t>/20</w:t>
             </w:r>
             <w:r>
               <w:rPr>
@@ -10697,15 +11434,23 @@
                 <w:sz w:val="26"/>
                 <w:szCs w:val="26"/>
               </w:rPr>
-              <w:t xml:space="preserve">Đến:  </w:t>
-            </w:r>
-            <w:r>
-              <w:rPr>
-                <w:rFonts w:ascii="Times New Roman" w:hAnsi="Times New Roman" w:cs="Times New Roman"/>
-                <w:sz w:val="26"/>
-                <w:szCs w:val="26"/>
-              </w:rPr>
-              <w:t>../../20</w:t>
+              <w:t xml:space="preserve">Đến: </w:t>
+            </w:r>
+            <w:r>
+              <w:rPr>
+                <w:rFonts w:ascii="Times New Roman" w:hAnsi="Times New Roman" w:cs="Times New Roman"/>
+                <w:sz w:val="26"/>
+                <w:szCs w:val="26"/>
+              </w:rPr>
+              <w:t>20/09</w:t>
+            </w:r>
+            <w:r>
+              <w:rPr>
+                <w:rFonts w:ascii="Times New Roman" w:hAnsi="Times New Roman" w:cs="Times New Roman"/>
+                <w:sz w:val="26"/>
+                <w:szCs w:val="26"/>
+              </w:rPr>
+              <w:t>/20</w:t>
             </w:r>
             <w:r>
               <w:rPr>
@@ -10741,6 +11486,24 @@
                 <w:szCs w:val="26"/>
               </w:rPr>
             </w:pPr>
+            <w:r>
+              <w:rPr>
+                <w:rFonts w:ascii="Times New Roman" w:hAnsi="Times New Roman" w:cs="Times New Roman"/>
+                <w:sz w:val="26"/>
+                <w:szCs w:val="26"/>
+              </w:rPr>
+              <w:lastRenderedPageBreak/>
+              <w:t>Code Module Quản lý Bệnh nhân (Thêm, sửa, xóa, tìm kiếm hồ sơ).</w:t>
+            </w:r>
+          </w:p>
+          <w:p>
+            <w:pPr>
+              <w:rPr>
+                <w:rFonts w:ascii="Times New Roman" w:hAnsi="Times New Roman" w:cs="Times New Roman"/>
+                <w:sz w:val="26"/>
+                <w:szCs w:val="26"/>
+              </w:rPr>
+            </w:pPr>
           </w:p>
         </w:tc>
         <w:tc>
@@ -10760,6 +11523,23 @@
               </w:rPr>
             </w:pPr>
           </w:p>
+          <w:p>
+            <w:pPr>
+              <w:rPr>
+                <w:rFonts w:ascii="Times New Roman" w:hAnsi="Times New Roman" w:cs="Times New Roman"/>
+                <w:sz w:val="26"/>
+                <w:szCs w:val="26"/>
+              </w:rPr>
+            </w:pPr>
+            <w:r>
+              <w:rPr>
+                <w:rFonts w:ascii="Times New Roman" w:hAnsi="Times New Roman" w:cs="Times New Roman"/>
+                <w:sz w:val="26"/>
+                <w:szCs w:val="26"/>
+              </w:rPr>
+              <w:t>Hồ Văn Khánh</w:t>
+            </w:r>
+          </w:p>
         </w:tc>
         <w:tc>
           <w:tcPr>
@@ -10768,6 +11548,43 @@
               <w:bottom w:val="dotted" w:sz="4" w:space="0" w:color="auto"/>
             </w:tcBorders>
           </w:tcPr>
+          <w:p>
+            <w:pPr>
+              <w:rPr>
+                <w:rFonts w:ascii="Times New Roman" w:hAnsi="Times New Roman" w:cs="Times New Roman"/>
+                <w:sz w:val="26"/>
+                <w:szCs w:val="26"/>
+              </w:rPr>
+            </w:pPr>
+            <w:r>
+              <w:rPr>
+                <w:rFonts w:ascii="Times New Roman" w:hAnsi="Times New Roman" w:cs="Times New Roman"/>
+                <w:sz w:val="26"/>
+                <w:szCs w:val="26"/>
+              </w:rPr>
+              <w:t xml:space="preserve"> </w:t>
+            </w:r>
+          </w:p>
+          <w:p>
+            <w:pPr>
+              <w:jc w:val="center"/>
+              <w:rPr>
+                <w:rFonts w:ascii="Times New Roman" w:hAnsi="Times New Roman" w:cs="Times New Roman"/>
+                <w:bCs/>
+                <w:sz w:val="26"/>
+                <w:szCs w:val="26"/>
+              </w:rPr>
+            </w:pPr>
+            <w:r>
+              <w:rPr>
+                <w:rFonts w:ascii="Times New Roman" w:hAnsi="Times New Roman" w:cs="Times New Roman"/>
+                <w:bCs/>
+                <w:sz w:val="26"/>
+                <w:szCs w:val="26"/>
+              </w:rPr>
+              <w:t>100%</w:t>
+            </w:r>
+          </w:p>
           <w:p>
             <w:pPr>
               <w:rPr>
@@ -10851,6 +11668,14 @@
                 <w:szCs w:val="26"/>
               </w:rPr>
             </w:pPr>
+            <w:r>
+              <w:rPr>
+                <w:rFonts w:ascii="Times New Roman" w:hAnsi="Times New Roman" w:cs="Times New Roman"/>
+                <w:sz w:val="26"/>
+                <w:szCs w:val="26"/>
+              </w:rPr>
+              <w:t>Code Module Quản lý Lịch hẹn và Tiếp nhận bệnh nhân.</w:t>
+            </w:r>
           </w:p>
         </w:tc>
         <w:tc>
@@ -10871,6 +11696,32 @@
               </w:rPr>
             </w:pPr>
           </w:p>
+          <w:p>
+            <w:pPr>
+              <w:rPr>
+                <w:rFonts w:ascii="Times New Roman" w:hAnsi="Times New Roman" w:cs="Times New Roman"/>
+                <w:sz w:val="26"/>
+                <w:szCs w:val="26"/>
+              </w:rPr>
+            </w:pPr>
+            <w:r>
+              <w:rPr>
+                <w:rFonts w:ascii="Times New Roman" w:hAnsi="Times New Roman" w:cs="Times New Roman"/>
+                <w:sz w:val="26"/>
+                <w:szCs w:val="26"/>
+              </w:rPr>
+              <w:t>Nguyễn Khắc Duy</w:t>
+            </w:r>
+          </w:p>
+          <w:p>
+            <w:pPr>
+              <w:rPr>
+                <w:rFonts w:ascii="Times New Roman" w:hAnsi="Times New Roman" w:cs="Times New Roman"/>
+                <w:sz w:val="26"/>
+                <w:szCs w:val="26"/>
+              </w:rPr>
+            </w:pPr>
+          </w:p>
         </w:tc>
         <w:tc>
           <w:tcPr>
@@ -10880,6 +11731,37 @@
               <w:bottom w:val="dotted" w:sz="4" w:space="0" w:color="auto"/>
             </w:tcBorders>
           </w:tcPr>
+          <w:p>
+            <w:pPr>
+              <w:jc w:val="center"/>
+              <w:rPr>
+                <w:rFonts w:ascii="Times New Roman" w:hAnsi="Times New Roman" w:cs="Times New Roman"/>
+                <w:bCs/>
+                <w:sz w:val="26"/>
+                <w:szCs w:val="26"/>
+              </w:rPr>
+            </w:pPr>
+          </w:p>
+          <w:p>
+            <w:pPr>
+              <w:jc w:val="center"/>
+              <w:rPr>
+                <w:rFonts w:ascii="Times New Roman" w:hAnsi="Times New Roman" w:cs="Times New Roman"/>
+                <w:bCs/>
+                <w:sz w:val="26"/>
+                <w:szCs w:val="26"/>
+              </w:rPr>
+            </w:pPr>
+            <w:r>
+              <w:rPr>
+                <w:rFonts w:ascii="Times New Roman" w:hAnsi="Times New Roman" w:cs="Times New Roman"/>
+                <w:bCs/>
+                <w:sz w:val="26"/>
+                <w:szCs w:val="26"/>
+              </w:rPr>
+              <w:t>100%</w:t>
+            </w:r>
+          </w:p>
           <w:p>
             <w:pPr>
               <w:rPr>
@@ -10966,6 +11848,32 @@
               </w:rPr>
             </w:pPr>
           </w:p>
+          <w:p>
+            <w:pPr>
+              <w:rPr>
+                <w:rFonts w:ascii="Times New Roman" w:hAnsi="Times New Roman" w:cs="Times New Roman"/>
+                <w:sz w:val="26"/>
+                <w:szCs w:val="26"/>
+              </w:rPr>
+            </w:pPr>
+            <w:r>
+              <w:rPr>
+                <w:rFonts w:ascii="Times New Roman" w:hAnsi="Times New Roman" w:cs="Times New Roman"/>
+                <w:sz w:val="26"/>
+                <w:szCs w:val="26"/>
+              </w:rPr>
+              <w:t>Review code đợt 1, ghép nối giao diện và xử lý logic kết nối Database của 2 module đầu.</w:t>
+            </w:r>
+          </w:p>
+          <w:p>
+            <w:pPr>
+              <w:rPr>
+                <w:rFonts w:ascii="Times New Roman" w:hAnsi="Times New Roman" w:cs="Times New Roman"/>
+                <w:sz w:val="26"/>
+                <w:szCs w:val="26"/>
+              </w:rPr>
+            </w:pPr>
+          </w:p>
         </w:tc>
         <w:tc>
           <w:tcPr>
@@ -10984,6 +11892,22 @@
                 <w:szCs w:val="26"/>
               </w:rPr>
             </w:pPr>
+            <w:r>
+              <w:rPr>
+                <w:rFonts w:ascii="Times New Roman" w:hAnsi="Times New Roman" w:cs="Times New Roman"/>
+                <w:sz w:val="26"/>
+                <w:szCs w:val="26"/>
+              </w:rPr>
+              <w:t>Tất cả thành viên</w:t>
+            </w:r>
+            <w:r>
+              <w:rPr>
+                <w:rFonts w:ascii="Times New Roman" w:hAnsi="Times New Roman" w:cs="Times New Roman"/>
+                <w:sz w:val="26"/>
+                <w:szCs w:val="26"/>
+              </w:rPr>
+              <w:t xml:space="preserve"> </w:t>
+            </w:r>
           </w:p>
         </w:tc>
         <w:tc>
@@ -10994,6 +11918,35 @@
               <w:bottom w:val="dotted" w:sz="4" w:space="0" w:color="auto"/>
             </w:tcBorders>
           </w:tcPr>
+          <w:p>
+            <w:pPr>
+              <w:rPr>
+                <w:rFonts w:ascii="Times New Roman" w:hAnsi="Times New Roman" w:cs="Times New Roman"/>
+                <w:sz w:val="26"/>
+                <w:szCs w:val="26"/>
+              </w:rPr>
+            </w:pPr>
+          </w:p>
+          <w:p>
+            <w:pPr>
+              <w:jc w:val="center"/>
+              <w:rPr>
+                <w:rFonts w:ascii="Times New Roman" w:hAnsi="Times New Roman" w:cs="Times New Roman"/>
+                <w:bCs/>
+                <w:sz w:val="26"/>
+                <w:szCs w:val="26"/>
+              </w:rPr>
+            </w:pPr>
+            <w:r>
+              <w:rPr>
+                <w:rFonts w:ascii="Times New Roman" w:hAnsi="Times New Roman" w:cs="Times New Roman"/>
+                <w:bCs/>
+                <w:sz w:val="26"/>
+                <w:szCs w:val="26"/>
+              </w:rPr>
+              <w:t>100%</w:t>
+            </w:r>
+          </w:p>
           <w:p>
             <w:pPr>
               <w:rPr>
@@ -11613,7 +12566,7 @@
       </w:tr>
       <w:tr>
         <w:trPr>
-          <w:trHeight w:val="340"/>
+          <w:trHeight w:val="85"/>
         </w:trPr>
         <w:tc>
           <w:tcPr>
@@ -12183,7 +13136,7 @@
       </w:tr>
       <w:tr>
         <w:trPr>
-          <w:trHeight w:val="340"/>
+          <w:trHeight w:val="85"/>
         </w:trPr>
         <w:tc>
           <w:tcPr>
@@ -12353,7 +13306,23 @@
                 <w:sz w:val="26"/>
                 <w:szCs w:val="26"/>
               </w:rPr>
-              <w:t>:  ../../20</w:t>
+              <w:t xml:space="preserve">:  </w:t>
+            </w:r>
+            <w:r>
+              <w:rPr>
+                <w:rFonts w:ascii="Times New Roman" w:hAnsi="Times New Roman" w:cs="Times New Roman"/>
+                <w:sz w:val="26"/>
+                <w:szCs w:val="26"/>
+              </w:rPr>
+              <w:t>21/09</w:t>
+            </w:r>
+            <w:r>
+              <w:rPr>
+                <w:rFonts w:ascii="Times New Roman" w:hAnsi="Times New Roman" w:cs="Times New Roman"/>
+                <w:sz w:val="26"/>
+                <w:szCs w:val="26"/>
+              </w:rPr>
+              <w:t>/20</w:t>
             </w:r>
             <w:r>
               <w:rPr>
@@ -12386,7 +13355,15 @@
                 <w:sz w:val="26"/>
                 <w:szCs w:val="26"/>
               </w:rPr>
-              <w:t>../../20</w:t>
+              <w:t>27/09</w:t>
+            </w:r>
+            <w:r>
+              <w:rPr>
+                <w:rFonts w:ascii="Times New Roman" w:hAnsi="Times New Roman" w:cs="Times New Roman"/>
+                <w:sz w:val="26"/>
+                <w:szCs w:val="26"/>
+              </w:rPr>
+              <w:t>/20</w:t>
             </w:r>
             <w:r>
               <w:rPr>
@@ -12423,6 +13400,32 @@
               </w:rPr>
             </w:pPr>
           </w:p>
+          <w:p>
+            <w:pPr>
+              <w:rPr>
+                <w:rFonts w:ascii="Times New Roman" w:hAnsi="Times New Roman" w:cs="Times New Roman"/>
+                <w:sz w:val="26"/>
+                <w:szCs w:val="26"/>
+              </w:rPr>
+            </w:pPr>
+            <w:r>
+              <w:rPr>
+                <w:rFonts w:ascii="Times New Roman" w:hAnsi="Times New Roman" w:cs="Times New Roman"/>
+                <w:sz w:val="26"/>
+                <w:szCs w:val="26"/>
+              </w:rPr>
+              <w:t>Code Module Khám và Chẩn đoán (Ghi nhận triệu chứng, tình trạng răng).</w:t>
+            </w:r>
+          </w:p>
+          <w:p>
+            <w:pPr>
+              <w:rPr>
+                <w:rFonts w:ascii="Times New Roman" w:hAnsi="Times New Roman" w:cs="Times New Roman"/>
+                <w:sz w:val="26"/>
+                <w:szCs w:val="26"/>
+              </w:rPr>
+            </w:pPr>
+          </w:p>
         </w:tc>
         <w:tc>
           <w:tcPr>
@@ -12440,6 +13443,14 @@
                 <w:szCs w:val="26"/>
               </w:rPr>
             </w:pPr>
+            <w:r>
+              <w:rPr>
+                <w:rFonts w:ascii="Times New Roman" w:hAnsi="Times New Roman" w:cs="Times New Roman"/>
+                <w:sz w:val="26"/>
+                <w:szCs w:val="26"/>
+              </w:rPr>
+              <w:t>Lê Trần Quang Thanh</w:t>
+            </w:r>
           </w:p>
         </w:tc>
         <w:tc>
@@ -12449,6 +13460,46 @@
               <w:bottom w:val="dotted" w:sz="4" w:space="0" w:color="auto"/>
             </w:tcBorders>
           </w:tcPr>
+          <w:p>
+            <w:pPr>
+              <w:rPr>
+                <w:rFonts w:ascii="Times New Roman" w:hAnsi="Times New Roman" w:cs="Times New Roman"/>
+                <w:sz w:val="26"/>
+                <w:szCs w:val="26"/>
+              </w:rPr>
+            </w:pPr>
+          </w:p>
+          <w:p>
+            <w:pPr>
+              <w:jc w:val="center"/>
+              <w:rPr>
+                <w:rFonts w:ascii="Times New Roman" w:hAnsi="Times New Roman" w:cs="Times New Roman"/>
+                <w:bCs/>
+                <w:sz w:val="26"/>
+                <w:szCs w:val="26"/>
+              </w:rPr>
+            </w:pPr>
+          </w:p>
+          <w:p>
+            <w:pPr>
+              <w:jc w:val="center"/>
+              <w:rPr>
+                <w:rFonts w:ascii="Times New Roman" w:hAnsi="Times New Roman" w:cs="Times New Roman"/>
+                <w:bCs/>
+                <w:sz w:val="26"/>
+                <w:szCs w:val="26"/>
+              </w:rPr>
+            </w:pPr>
+            <w:r>
+              <w:rPr>
+                <w:rFonts w:ascii="Times New Roman" w:hAnsi="Times New Roman" w:cs="Times New Roman"/>
+                <w:bCs/>
+                <w:sz w:val="26"/>
+                <w:szCs w:val="26"/>
+              </w:rPr>
+              <w:t>100%</w:t>
+            </w:r>
+          </w:p>
           <w:p>
             <w:pPr>
               <w:rPr>
@@ -12533,6 +13584,32 @@
               </w:rPr>
             </w:pPr>
           </w:p>
+          <w:p>
+            <w:pPr>
+              <w:rPr>
+                <w:rFonts w:ascii="Times New Roman" w:hAnsi="Times New Roman" w:cs="Times New Roman"/>
+                <w:sz w:val="26"/>
+                <w:szCs w:val="26"/>
+              </w:rPr>
+            </w:pPr>
+            <w:r>
+              <w:rPr>
+                <w:rFonts w:ascii="Times New Roman" w:hAnsi="Times New Roman" w:cs="Times New Roman"/>
+                <w:sz w:val="26"/>
+                <w:szCs w:val="26"/>
+              </w:rPr>
+              <w:t>Cập nhật và điều chỉnh giao diện (UI) dựa trên dữ liệu thực tế đẩy lên từ Database.</w:t>
+            </w:r>
+          </w:p>
+          <w:p>
+            <w:pPr>
+              <w:rPr>
+                <w:rFonts w:ascii="Times New Roman" w:hAnsi="Times New Roman" w:cs="Times New Roman"/>
+                <w:sz w:val="26"/>
+                <w:szCs w:val="26"/>
+              </w:rPr>
+            </w:pPr>
+          </w:p>
         </w:tc>
         <w:tc>
           <w:tcPr>
@@ -12551,6 +13628,15 @@
                 <w:szCs w:val="26"/>
               </w:rPr>
             </w:pPr>
+            <w:r>
+              <w:rPr>
+                <w:rFonts w:ascii="Times New Roman" w:hAnsi="Times New Roman" w:cs="Times New Roman"/>
+                <w:sz w:val="26"/>
+                <w:szCs w:val="26"/>
+              </w:rPr>
+              <w:lastRenderedPageBreak/>
+              <w:t>Nguyễn Minh Thuận</w:t>
+            </w:r>
           </w:p>
         </w:tc>
         <w:tc>
@@ -12563,6 +13649,46 @@
           </w:tcPr>
           <w:p>
             <w:pPr>
+              <w:rPr>
+                <w:rFonts w:ascii="Times New Roman" w:hAnsi="Times New Roman" w:cs="Times New Roman"/>
+                <w:sz w:val="26"/>
+                <w:szCs w:val="26"/>
+              </w:rPr>
+            </w:pPr>
+          </w:p>
+          <w:p>
+            <w:pPr>
+              <w:rPr>
+                <w:rFonts w:ascii="Times New Roman" w:hAnsi="Times New Roman" w:cs="Times New Roman"/>
+                <w:bCs/>
+                <w:sz w:val="26"/>
+                <w:szCs w:val="26"/>
+              </w:rPr>
+            </w:pPr>
+          </w:p>
+          <w:p>
+            <w:pPr>
+              <w:jc w:val="center"/>
+              <w:rPr>
+                <w:rFonts w:ascii="Times New Roman" w:hAnsi="Times New Roman" w:cs="Times New Roman"/>
+                <w:bCs/>
+                <w:sz w:val="26"/>
+                <w:szCs w:val="26"/>
+              </w:rPr>
+            </w:pPr>
+            <w:r>
+              <w:rPr>
+                <w:rFonts w:ascii="Times New Roman" w:hAnsi="Times New Roman" w:cs="Times New Roman"/>
+                <w:bCs/>
+                <w:sz w:val="26"/>
+                <w:szCs w:val="26"/>
+              </w:rPr>
+              <w:t>100%</w:t>
+            </w:r>
+          </w:p>
+          <w:p>
+            <w:pPr>
+              <w:jc w:val="center"/>
               <w:rPr>
                 <w:rFonts w:ascii="Times New Roman" w:hAnsi="Times New Roman" w:cs="Times New Roman"/>
                 <w:sz w:val="26"/>
@@ -12647,6 +13773,15 @@
               </w:rPr>
             </w:pPr>
           </w:p>
+          <w:p>
+            <w:pPr>
+              <w:rPr>
+                <w:rFonts w:ascii="Times New Roman" w:hAnsi="Times New Roman" w:cs="Times New Roman"/>
+                <w:sz w:val="26"/>
+                <w:szCs w:val="26"/>
+              </w:rPr>
+            </w:pPr>
+          </w:p>
         </w:tc>
         <w:tc>
           <w:tcPr>
@@ -12679,6 +13814,28 @@
             <w:pPr>
               <w:rPr>
                 <w:rFonts w:ascii="Times New Roman" w:hAnsi="Times New Roman" w:cs="Times New Roman"/>
+                <w:sz w:val="26"/>
+                <w:szCs w:val="26"/>
+              </w:rPr>
+            </w:pPr>
+          </w:p>
+          <w:p>
+            <w:pPr>
+              <w:jc w:val="center"/>
+              <w:rPr>
+                <w:rFonts w:ascii="Times New Roman" w:hAnsi="Times New Roman" w:cs="Times New Roman"/>
+                <w:bCs/>
+                <w:sz w:val="26"/>
+                <w:szCs w:val="26"/>
+              </w:rPr>
+            </w:pPr>
+          </w:p>
+          <w:p>
+            <w:pPr>
+              <w:jc w:val="center"/>
+              <w:rPr>
+                <w:rFonts w:ascii="Times New Roman" w:hAnsi="Times New Roman" w:cs="Times New Roman"/>
+                <w:bCs/>
                 <w:sz w:val="26"/>
                 <w:szCs w:val="26"/>
               </w:rPr>
@@ -13750,7 +14907,7 @@
       </w:tr>
       <w:tr>
         <w:trPr>
-          <w:trHeight w:val="340"/>
+          <w:trHeight w:val="85"/>
         </w:trPr>
         <w:tc>
           <w:tcPr>
@@ -13920,7 +15077,23 @@
                 <w:sz w:val="26"/>
                 <w:szCs w:val="26"/>
               </w:rPr>
-              <w:t>:  ../../20</w:t>
+              <w:t xml:space="preserve">:  </w:t>
+            </w:r>
+            <w:r>
+              <w:rPr>
+                <w:rFonts w:ascii="Times New Roman" w:hAnsi="Times New Roman" w:cs="Times New Roman"/>
+                <w:sz w:val="26"/>
+                <w:szCs w:val="26"/>
+              </w:rPr>
+              <w:t>28/09</w:t>
+            </w:r>
+            <w:r>
+              <w:rPr>
+                <w:rFonts w:ascii="Times New Roman" w:hAnsi="Times New Roman" w:cs="Times New Roman"/>
+                <w:sz w:val="26"/>
+                <w:szCs w:val="26"/>
+              </w:rPr>
+              <w:t>/20</w:t>
             </w:r>
             <w:r>
               <w:rPr>
@@ -13953,7 +15126,15 @@
                 <w:sz w:val="26"/>
                 <w:szCs w:val="26"/>
               </w:rPr>
-              <w:t>../../20</w:t>
+              <w:t>04/10</w:t>
+            </w:r>
+            <w:r>
+              <w:rPr>
+                <w:rFonts w:ascii="Times New Roman" w:hAnsi="Times New Roman" w:cs="Times New Roman"/>
+                <w:sz w:val="26"/>
+                <w:szCs w:val="26"/>
+              </w:rPr>
+              <w:t>/20</w:t>
             </w:r>
             <w:r>
               <w:rPr>
@@ -13990,6 +15171,32 @@
               </w:rPr>
             </w:pPr>
           </w:p>
+          <w:p>
+            <w:pPr>
+              <w:rPr>
+                <w:rFonts w:ascii="Times New Roman" w:hAnsi="Times New Roman" w:cs="Times New Roman"/>
+                <w:sz w:val="26"/>
+                <w:szCs w:val="26"/>
+              </w:rPr>
+            </w:pPr>
+            <w:r>
+              <w:rPr>
+                <w:rFonts w:ascii="Times New Roman" w:hAnsi="Times New Roman" w:cs="Times New Roman"/>
+                <w:sz w:val="26"/>
+                <w:szCs w:val="26"/>
+              </w:rPr>
+              <w:t>Code Module Điều trị (Cập nhật thủ thuật, vật tư y tế) và Tái khám.</w:t>
+            </w:r>
+          </w:p>
+          <w:p>
+            <w:pPr>
+              <w:rPr>
+                <w:rFonts w:ascii="Times New Roman" w:hAnsi="Times New Roman" w:cs="Times New Roman"/>
+                <w:sz w:val="26"/>
+                <w:szCs w:val="26"/>
+              </w:rPr>
+            </w:pPr>
+          </w:p>
         </w:tc>
         <w:tc>
           <w:tcPr>
@@ -14008,6 +15215,58 @@
               </w:rPr>
             </w:pPr>
           </w:p>
+          <w:p>
+            <w:pPr>
+              <w:rPr>
+                <w:rFonts w:ascii="Times New Roman" w:hAnsi="Times New Roman" w:cs="Times New Roman"/>
+                <w:sz w:val="26"/>
+                <w:szCs w:val="26"/>
+              </w:rPr>
+            </w:pPr>
+            <w:r>
+              <w:rPr>
+                <w:rFonts w:ascii="Times New Roman" w:hAnsi="Times New Roman" w:cs="Times New Roman"/>
+                <w:sz w:val="26"/>
+                <w:szCs w:val="26"/>
+              </w:rPr>
+              <w:t>Nguyễn Minh Thuận</w:t>
+            </w:r>
+          </w:p>
+          <w:p>
+            <w:pPr>
+              <w:rPr>
+                <w:rFonts w:ascii="Times New Roman" w:hAnsi="Times New Roman" w:cs="Times New Roman"/>
+                <w:sz w:val="26"/>
+                <w:szCs w:val="26"/>
+              </w:rPr>
+            </w:pPr>
+          </w:p>
+          <w:p>
+            <w:pPr>
+              <w:rPr>
+                <w:rFonts w:ascii="Times New Roman" w:hAnsi="Times New Roman" w:cs="Times New Roman"/>
+                <w:sz w:val="26"/>
+                <w:szCs w:val="26"/>
+              </w:rPr>
+            </w:pPr>
+            <w:r>
+              <w:rPr>
+                <w:rFonts w:ascii="Times New Roman" w:hAnsi="Times New Roman" w:cs="Times New Roman"/>
+                <w:sz w:val="26"/>
+                <w:szCs w:val="26"/>
+              </w:rPr>
+              <w:t>Hồ Văn Khánh</w:t>
+            </w:r>
+          </w:p>
+          <w:p>
+            <w:pPr>
+              <w:rPr>
+                <w:rFonts w:ascii="Times New Roman" w:hAnsi="Times New Roman" w:cs="Times New Roman"/>
+                <w:sz w:val="26"/>
+                <w:szCs w:val="26"/>
+              </w:rPr>
+            </w:pPr>
+          </w:p>
         </w:tc>
         <w:tc>
           <w:tcPr>
@@ -14016,6 +15275,44 @@
               <w:bottom w:val="dotted" w:sz="4" w:space="0" w:color="auto"/>
             </w:tcBorders>
           </w:tcPr>
+          <w:p>
+            <w:pPr>
+              <w:rPr>
+                <w:rFonts w:ascii="Times New Roman" w:hAnsi="Times New Roman" w:cs="Times New Roman"/>
+                <w:sz w:val="26"/>
+                <w:szCs w:val="26"/>
+              </w:rPr>
+            </w:pPr>
+          </w:p>
+          <w:p>
+            <w:pPr>
+              <w:rPr>
+                <w:rFonts w:ascii="Times New Roman" w:hAnsi="Times New Roman" w:cs="Times New Roman"/>
+                <w:sz w:val="26"/>
+                <w:szCs w:val="26"/>
+              </w:rPr>
+            </w:pPr>
+          </w:p>
+          <w:p>
+            <w:pPr>
+              <w:jc w:val="center"/>
+              <w:rPr>
+                <w:rFonts w:ascii="Times New Roman" w:hAnsi="Times New Roman" w:cs="Times New Roman"/>
+                <w:bCs/>
+                <w:sz w:val="26"/>
+                <w:szCs w:val="26"/>
+              </w:rPr>
+            </w:pPr>
+            <w:r>
+              <w:rPr>
+                <w:rFonts w:ascii="Times New Roman" w:hAnsi="Times New Roman" w:cs="Times New Roman"/>
+                <w:bCs/>
+                <w:sz w:val="26"/>
+                <w:szCs w:val="26"/>
+              </w:rPr>
+              <w:t>100%</w:t>
+            </w:r>
+          </w:p>
           <w:p>
             <w:pPr>
               <w:rPr>
@@ -14100,6 +15397,49 @@
               </w:rPr>
             </w:pPr>
           </w:p>
+          <w:p>
+            <w:pPr>
+              <w:rPr>
+                <w:rFonts w:ascii="Times New Roman" w:hAnsi="Times New Roman" w:cs="Times New Roman"/>
+                <w:sz w:val="26"/>
+                <w:szCs w:val="26"/>
+              </w:rPr>
+            </w:pPr>
+            <w:r>
+              <w:rPr>
+                <w:rFonts w:ascii="Times New Roman" w:hAnsi="Times New Roman" w:cs="Times New Roman"/>
+                <w:sz w:val="26"/>
+                <w:szCs w:val="26"/>
+              </w:rPr>
+              <w:t xml:space="preserve">Bắt lỗi (Validation) nhập liệu tại các form Khám, Chẩn đoán và </w:t>
+            </w:r>
+          </w:p>
+          <w:p>
+            <w:pPr>
+              <w:rPr>
+                <w:rFonts w:ascii="Times New Roman" w:hAnsi="Times New Roman" w:cs="Times New Roman"/>
+                <w:sz w:val="26"/>
+                <w:szCs w:val="26"/>
+              </w:rPr>
+            </w:pPr>
+            <w:r>
+              <w:rPr>
+                <w:rFonts w:ascii="Times New Roman" w:hAnsi="Times New Roman" w:cs="Times New Roman"/>
+                <w:sz w:val="26"/>
+                <w:szCs w:val="26"/>
+              </w:rPr>
+              <w:t>Lịch hẹn.</w:t>
+            </w:r>
+          </w:p>
+          <w:p>
+            <w:pPr>
+              <w:rPr>
+                <w:rFonts w:ascii="Times New Roman" w:hAnsi="Times New Roman" w:cs="Times New Roman"/>
+                <w:sz w:val="26"/>
+                <w:szCs w:val="26"/>
+              </w:rPr>
+            </w:pPr>
+          </w:p>
         </w:tc>
         <w:tc>
           <w:tcPr>
@@ -14118,6 +15458,49 @@
                 <w:szCs w:val="26"/>
               </w:rPr>
             </w:pPr>
+            <w:r>
+              <w:rPr>
+                <w:rFonts w:ascii="Times New Roman" w:hAnsi="Times New Roman" w:cs="Times New Roman"/>
+                <w:sz w:val="26"/>
+                <w:szCs w:val="26"/>
+              </w:rPr>
+              <w:t>Nguyễn Khắc Duy</w:t>
+            </w:r>
+          </w:p>
+          <w:p>
+            <w:pPr>
+              <w:rPr>
+                <w:rFonts w:ascii="Times New Roman" w:hAnsi="Times New Roman" w:cs="Times New Roman"/>
+                <w:sz w:val="26"/>
+                <w:szCs w:val="26"/>
+              </w:rPr>
+            </w:pPr>
+          </w:p>
+          <w:p>
+            <w:pPr>
+              <w:rPr>
+                <w:rFonts w:ascii="Times New Roman" w:hAnsi="Times New Roman" w:cs="Times New Roman"/>
+                <w:sz w:val="26"/>
+                <w:szCs w:val="26"/>
+              </w:rPr>
+            </w:pPr>
+            <w:r>
+              <w:rPr>
+                <w:rFonts w:ascii="Times New Roman" w:hAnsi="Times New Roman" w:cs="Times New Roman"/>
+                <w:sz w:val="26"/>
+                <w:szCs w:val="26"/>
+              </w:rPr>
+              <w:t>Nguyễn Minh Lý</w:t>
+            </w:r>
+          </w:p>
+          <w:p>
+            <w:pPr>
+              <w:rPr>
+                <w:rFonts w:ascii="Times New Roman" w:hAnsi="Times New Roman" w:cs="Times New Roman"/>
+                <w:sz w:val="26"/>
+                <w:szCs w:val="26"/>
+              </w:rPr>
+            </w:pPr>
           </w:p>
         </w:tc>
         <w:tc>
@@ -14130,6 +15513,176 @@
           </w:tcPr>
           <w:p>
             <w:pPr>
+              <w:rPr>
+                <w:rFonts w:ascii="Times New Roman" w:hAnsi="Times New Roman" w:cs="Times New Roman"/>
+                <w:sz w:val="26"/>
+                <w:szCs w:val="26"/>
+              </w:rPr>
+            </w:pPr>
+          </w:p>
+          <w:p>
+            <w:pPr>
+              <w:rPr>
+                <w:rFonts w:ascii="Times New Roman" w:hAnsi="Times New Roman" w:cs="Times New Roman"/>
+                <w:sz w:val="26"/>
+                <w:szCs w:val="26"/>
+              </w:rPr>
+            </w:pPr>
+          </w:p>
+          <w:p>
+            <w:pPr>
+              <w:jc w:val="center"/>
+              <w:rPr>
+                <w:rFonts w:ascii="Times New Roman" w:hAnsi="Times New Roman" w:cs="Times New Roman"/>
+                <w:bCs/>
+                <w:sz w:val="26"/>
+                <w:szCs w:val="26"/>
+              </w:rPr>
+            </w:pPr>
+            <w:r>
+              <w:rPr>
+                <w:rFonts w:ascii="Times New Roman" w:hAnsi="Times New Roman" w:cs="Times New Roman"/>
+                <w:bCs/>
+                <w:sz w:val="26"/>
+                <w:szCs w:val="26"/>
+              </w:rPr>
+              <w:t>100%</w:t>
+            </w:r>
+          </w:p>
+          <w:p>
+            <w:pPr>
+              <w:rPr>
+                <w:rFonts w:ascii="Times New Roman" w:hAnsi="Times New Roman" w:cs="Times New Roman"/>
+                <w:sz w:val="26"/>
+                <w:szCs w:val="26"/>
+              </w:rPr>
+            </w:pPr>
+          </w:p>
+        </w:tc>
+        <w:tc>
+          <w:tcPr>
+            <w:tcW w:w="883" w:type="pct"/>
+            <w:tcBorders>
+              <w:top w:val="dotted" w:sz="4" w:space="0" w:color="auto"/>
+              <w:bottom w:val="dotted" w:sz="4" w:space="0" w:color="auto"/>
+            </w:tcBorders>
+          </w:tcPr>
+          <w:p>
+            <w:pPr>
+              <w:rPr>
+                <w:rFonts w:ascii="Times New Roman" w:hAnsi="Times New Roman" w:cs="Times New Roman"/>
+                <w:sz w:val="26"/>
+                <w:szCs w:val="26"/>
+              </w:rPr>
+            </w:pPr>
+          </w:p>
+        </w:tc>
+        <w:tc>
+          <w:tcPr>
+            <w:tcW w:w="707" w:type="pct"/>
+            <w:tcBorders>
+              <w:top w:val="dotted" w:sz="4" w:space="0" w:color="auto"/>
+              <w:bottom w:val="dotted" w:sz="4" w:space="0" w:color="auto"/>
+            </w:tcBorders>
+          </w:tcPr>
+          <w:p>
+            <w:pPr>
+              <w:rPr>
+                <w:rFonts w:ascii="Times New Roman" w:hAnsi="Times New Roman" w:cs="Times New Roman"/>
+                <w:sz w:val="26"/>
+                <w:szCs w:val="26"/>
+              </w:rPr>
+            </w:pPr>
+            <w:r>
+              <w:rPr>
+                <w:rFonts w:ascii="Times New Roman" w:hAnsi="Times New Roman" w:cs="Times New Roman"/>
+                <w:sz w:val="26"/>
+                <w:szCs w:val="26"/>
+              </w:rPr>
+              <w:t>Đảm bảo tính toàn vẹn dữ liệu</w:t>
+            </w:r>
+          </w:p>
+        </w:tc>
+      </w:tr>
+      <w:tr>
+        <w:trPr>
+          <w:trHeight w:val="273"/>
+        </w:trPr>
+        <w:tc>
+          <w:tcPr>
+            <w:tcW w:w="610" w:type="pct"/>
+            <w:vMerge/>
+            <w:vAlign w:val="center"/>
+          </w:tcPr>
+          <w:p>
+            <w:pPr>
+              <w:rPr>
+                <w:rFonts w:ascii="Times New Roman" w:hAnsi="Times New Roman" w:cs="Times New Roman"/>
+                <w:b/>
+                <w:sz w:val="26"/>
+                <w:szCs w:val="26"/>
+              </w:rPr>
+            </w:pPr>
+          </w:p>
+        </w:tc>
+        <w:tc>
+          <w:tcPr>
+            <w:tcW w:w="1366" w:type="pct"/>
+            <w:tcBorders>
+              <w:top w:val="dotted" w:sz="4" w:space="0" w:color="auto"/>
+              <w:bottom w:val="dotted" w:sz="4" w:space="0" w:color="auto"/>
+            </w:tcBorders>
+            <w:vAlign w:val="center"/>
+          </w:tcPr>
+          <w:p>
+            <w:pPr>
+              <w:rPr>
+                <w:rFonts w:ascii="Times New Roman" w:hAnsi="Times New Roman" w:cs="Times New Roman"/>
+                <w:sz w:val="26"/>
+                <w:szCs w:val="26"/>
+              </w:rPr>
+            </w:pPr>
+          </w:p>
+        </w:tc>
+        <w:tc>
+          <w:tcPr>
+            <w:tcW w:w="984" w:type="pct"/>
+            <w:tcBorders>
+              <w:top w:val="dotted" w:sz="4" w:space="0" w:color="auto"/>
+              <w:bottom w:val="dotted" w:sz="4" w:space="0" w:color="auto"/>
+            </w:tcBorders>
+            <w:vAlign w:val="center"/>
+          </w:tcPr>
+          <w:p>
+            <w:pPr>
+              <w:rPr>
+                <w:rFonts w:ascii="Times New Roman" w:hAnsi="Times New Roman" w:cs="Times New Roman"/>
+                <w:sz w:val="26"/>
+                <w:szCs w:val="26"/>
+              </w:rPr>
+            </w:pPr>
+          </w:p>
+        </w:tc>
+        <w:tc>
+          <w:tcPr>
+            <w:tcW w:w="449" w:type="pct"/>
+            <w:tcBorders>
+              <w:top w:val="dotted" w:sz="4" w:space="0" w:color="auto"/>
+              <w:bottom w:val="dotted" w:sz="4" w:space="0" w:color="auto"/>
+            </w:tcBorders>
+          </w:tcPr>
+          <w:p>
+            <w:pPr>
+              <w:rPr>
+                <w:rFonts w:ascii="Times New Roman" w:hAnsi="Times New Roman" w:cs="Times New Roman"/>
+                <w:sz w:val="26"/>
+                <w:szCs w:val="26"/>
+              </w:rPr>
+            </w:pPr>
+          </w:p>
+          <w:p>
+            <w:pPr>
+              <w:jc w:val="center"/>
               <w:rPr>
                 <w:rFonts w:ascii="Times New Roman" w:hAnsi="Times New Roman" w:cs="Times New Roman"/>
                 <w:sz w:val="26"/>
@@ -14233,6 +15786,33 @@
               </w:rPr>
             </w:pPr>
           </w:p>
+          <w:p>
+            <w:pPr>
+              <w:rPr>
+                <w:rFonts w:ascii="Times New Roman" w:hAnsi="Times New Roman" w:cs="Times New Roman"/>
+                <w:sz w:val="26"/>
+                <w:szCs w:val="26"/>
+              </w:rPr>
+            </w:pPr>
+          </w:p>
+          <w:p>
+            <w:pPr>
+              <w:rPr>
+                <w:rFonts w:ascii="Times New Roman" w:hAnsi="Times New Roman" w:cs="Times New Roman"/>
+                <w:sz w:val="26"/>
+                <w:szCs w:val="26"/>
+              </w:rPr>
+            </w:pPr>
+          </w:p>
+          <w:p>
+            <w:pPr>
+              <w:rPr>
+                <w:rFonts w:ascii="Times New Roman" w:hAnsi="Times New Roman" w:cs="Times New Roman"/>
+                <w:sz w:val="26"/>
+                <w:szCs w:val="26"/>
+              </w:rPr>
+            </w:pPr>
+          </w:p>
         </w:tc>
         <w:tc>
           <w:tcPr>
@@ -14244,6 +15824,43 @@
           </w:tcPr>
           <w:p>
             <w:pPr>
+              <w:rPr>
+                <w:rFonts w:ascii="Times New Roman" w:hAnsi="Times New Roman" w:cs="Times New Roman"/>
+                <w:sz w:val="26"/>
+                <w:szCs w:val="26"/>
+              </w:rPr>
+            </w:pPr>
+          </w:p>
+          <w:p>
+            <w:pPr>
+              <w:rPr>
+                <w:rFonts w:ascii="Times New Roman" w:hAnsi="Times New Roman" w:cs="Times New Roman"/>
+                <w:sz w:val="26"/>
+                <w:szCs w:val="26"/>
+              </w:rPr>
+            </w:pPr>
+          </w:p>
+          <w:p>
+            <w:pPr>
+              <w:rPr>
+                <w:rFonts w:ascii="Times New Roman" w:hAnsi="Times New Roman" w:cs="Times New Roman"/>
+                <w:sz w:val="26"/>
+                <w:szCs w:val="26"/>
+              </w:rPr>
+            </w:pPr>
+          </w:p>
+          <w:p>
+            <w:pPr>
+              <w:rPr>
+                <w:rFonts w:ascii="Times New Roman" w:hAnsi="Times New Roman" w:cs="Times New Roman"/>
+                <w:sz w:val="26"/>
+                <w:szCs w:val="26"/>
+              </w:rPr>
+            </w:pPr>
+          </w:p>
+          <w:p>
+            <w:pPr>
+              <w:jc w:val="center"/>
               <w:rPr>
                 <w:rFonts w:ascii="Times New Roman" w:hAnsi="Times New Roman" w:cs="Times New Roman"/>
                 <w:sz w:val="26"/>
@@ -15203,7 +16820,7 @@
       </w:tr>
       <w:tr>
         <w:trPr>
-          <w:trHeight w:val="340"/>
+          <w:trHeight w:val="85"/>
         </w:trPr>
         <w:tc>
           <w:tcPr>
@@ -15227,7 +16844,7 @@
             <w:tcW w:w="1366" w:type="pct"/>
             <w:tcBorders>
               <w:top w:val="dotted" w:sz="4" w:space="0" w:color="auto"/>
-              <w:bottom w:val="dotted" w:sz="4" w:space="0" w:color="auto"/>
+              <w:bottom w:val="single" w:sz="4" w:space="0" w:color="auto"/>
             </w:tcBorders>
             <w:vAlign w:val="center"/>
           </w:tcPr>
@@ -15246,7 +16863,7 @@
             <w:tcW w:w="984" w:type="pct"/>
             <w:tcBorders>
               <w:top w:val="dotted" w:sz="4" w:space="0" w:color="auto"/>
-              <w:bottom w:val="dotted" w:sz="4" w:space="0" w:color="auto"/>
+              <w:bottom w:val="single" w:sz="4" w:space="0" w:color="auto"/>
             </w:tcBorders>
             <w:vAlign w:val="center"/>
           </w:tcPr>
@@ -15265,7 +16882,7 @@
             <w:tcW w:w="449" w:type="pct"/>
             <w:tcBorders>
               <w:top w:val="dotted" w:sz="4" w:space="0" w:color="auto"/>
-              <w:bottom w:val="dotted" w:sz="4" w:space="0" w:color="auto"/>
+              <w:bottom w:val="single" w:sz="4" w:space="0" w:color="auto"/>
             </w:tcBorders>
           </w:tcPr>
           <w:p>
@@ -15283,7 +16900,7 @@
             <w:tcW w:w="883" w:type="pct"/>
             <w:tcBorders>
               <w:top w:val="dotted" w:sz="4" w:space="0" w:color="auto"/>
-              <w:bottom w:val="dotted" w:sz="4" w:space="0" w:color="auto"/>
+              <w:bottom w:val="single" w:sz="4" w:space="0" w:color="auto"/>
             </w:tcBorders>
           </w:tcPr>
           <w:p>
@@ -15301,7 +16918,7 @@
             <w:tcW w:w="707" w:type="pct"/>
             <w:tcBorders>
               <w:top w:val="dotted" w:sz="4" w:space="0" w:color="auto"/>
-              <w:bottom w:val="dotted" w:sz="4" w:space="0" w:color="auto"/>
+              <w:bottom w:val="single" w:sz="4" w:space="0" w:color="auto"/>
             </w:tcBorders>
           </w:tcPr>
           <w:p>
@@ -15322,29 +16939,160 @@
         <w:tc>
           <w:tcPr>
             <w:tcW w:w="610" w:type="pct"/>
-            <w:vMerge/>
-            <w:vAlign w:val="center"/>
-          </w:tcPr>
-          <w:p>
-            <w:pPr>
+            <w:vMerge w:val="restart"/>
+            <w:vAlign w:val="center"/>
+          </w:tcPr>
+          <w:p>
+            <w:pPr>
+              <w:rPr>
+                <w:rFonts w:ascii="Times New Roman" w:hAnsi="Times New Roman" w:cs="Times New Roman"/>
+                <w:sz w:val="26"/>
+                <w:szCs w:val="26"/>
+              </w:rPr>
+            </w:pPr>
+            <w:r>
               <w:rPr>
                 <w:rFonts w:ascii="Times New Roman" w:hAnsi="Times New Roman" w:cs="Times New Roman"/>
                 <w:b/>
                 <w:sz w:val="26"/>
                 <w:szCs w:val="26"/>
               </w:rPr>
-            </w:pPr>
+              <w:t>Tuần 09</w:t>
+            </w:r>
+            <w:r>
+              <w:rPr>
+                <w:rFonts w:ascii="Times New Roman" w:hAnsi="Times New Roman" w:cs="Times New Roman"/>
+                <w:sz w:val="26"/>
+                <w:szCs w:val="26"/>
+              </w:rPr>
+              <w:t xml:space="preserve"> </w:t>
+            </w:r>
+          </w:p>
+          <w:p>
+            <w:pPr>
+              <w:rPr>
+                <w:rFonts w:ascii="Times New Roman" w:hAnsi="Times New Roman" w:cs="Times New Roman"/>
+                <w:sz w:val="26"/>
+                <w:szCs w:val="26"/>
+              </w:rPr>
+            </w:pPr>
+            <w:r>
+              <w:rPr>
+                <w:rFonts w:ascii="Times New Roman" w:hAnsi="Times New Roman" w:cs="Times New Roman"/>
+                <w:sz w:val="26"/>
+                <w:szCs w:val="26"/>
+              </w:rPr>
+              <w:t>(Từ</w:t>
+            </w:r>
+            <w:r>
+              <w:rPr>
+                <w:rFonts w:ascii="Times New Roman" w:hAnsi="Times New Roman" w:cs="Times New Roman"/>
+                <w:sz w:val="26"/>
+                <w:szCs w:val="26"/>
+              </w:rPr>
+              <w:t xml:space="preserve">:  </w:t>
+            </w:r>
+            <w:r>
+              <w:rPr>
+                <w:rFonts w:ascii="Times New Roman" w:hAnsi="Times New Roman" w:cs="Times New Roman"/>
+                <w:sz w:val="26"/>
+                <w:szCs w:val="26"/>
+              </w:rPr>
+              <w:t>05/10</w:t>
+            </w:r>
+            <w:r>
+              <w:rPr>
+                <w:rFonts w:ascii="Times New Roman" w:hAnsi="Times New Roman" w:cs="Times New Roman"/>
+                <w:sz w:val="26"/>
+                <w:szCs w:val="26"/>
+              </w:rPr>
+              <w:t>/2026</w:t>
+            </w:r>
+          </w:p>
+          <w:p>
+            <w:pPr>
+              <w:rPr>
+                <w:rFonts w:ascii="Times New Roman" w:hAnsi="Times New Roman" w:cs="Times New Roman"/>
+                <w:sz w:val="26"/>
+                <w:szCs w:val="26"/>
+              </w:rPr>
+            </w:pPr>
+            <w:r>
+              <w:rPr>
+                <w:rFonts w:ascii="Times New Roman" w:hAnsi="Times New Roman" w:cs="Times New Roman"/>
+                <w:sz w:val="26"/>
+                <w:szCs w:val="26"/>
+              </w:rPr>
+              <w:t xml:space="preserve">Đến:  </w:t>
+            </w:r>
+            <w:r>
+              <w:rPr>
+                <w:rFonts w:ascii="Times New Roman" w:hAnsi="Times New Roman" w:cs="Times New Roman"/>
+                <w:sz w:val="26"/>
+                <w:szCs w:val="26"/>
+              </w:rPr>
+              <w:t>11/10</w:t>
+            </w:r>
+            <w:r>
+              <w:rPr>
+                <w:rFonts w:ascii="Times New Roman" w:hAnsi="Times New Roman" w:cs="Times New Roman"/>
+                <w:sz w:val="26"/>
+                <w:szCs w:val="26"/>
+              </w:rPr>
+              <w:t>/2026</w:t>
+            </w:r>
+            <w:r>
+              <w:rPr>
+                <w:rFonts w:ascii="Times New Roman" w:hAnsi="Times New Roman" w:cs="Times New Roman"/>
+                <w:sz w:val="26"/>
+                <w:szCs w:val="26"/>
+              </w:rPr>
+              <w:t>)</w:t>
+            </w:r>
           </w:p>
         </w:tc>
         <w:tc>
           <w:tcPr>
             <w:tcW w:w="1366" w:type="pct"/>
             <w:tcBorders>
-              <w:top w:val="dotted" w:sz="4" w:space="0" w:color="auto"/>
-              <w:bottom w:val="single" w:sz="4" w:space="0" w:color="auto"/>
-            </w:tcBorders>
-            <w:vAlign w:val="center"/>
-          </w:tcPr>
+              <w:bottom w:val="dotted" w:sz="4" w:space="0" w:color="auto"/>
+            </w:tcBorders>
+            <w:vAlign w:val="center"/>
+          </w:tcPr>
+          <w:p>
+            <w:pPr>
+              <w:rPr>
+                <w:rFonts w:ascii="Times New Roman" w:hAnsi="Times New Roman" w:cs="Times New Roman"/>
+                <w:sz w:val="26"/>
+                <w:szCs w:val="26"/>
+              </w:rPr>
+            </w:pPr>
+          </w:p>
+          <w:p>
+            <w:pPr>
+              <w:rPr>
+                <w:rFonts w:ascii="Times New Roman" w:hAnsi="Times New Roman" w:cs="Times New Roman"/>
+                <w:sz w:val="26"/>
+                <w:szCs w:val="26"/>
+              </w:rPr>
+            </w:pPr>
+            <w:r>
+              <w:rPr>
+                <w:rFonts w:ascii="Times New Roman" w:hAnsi="Times New Roman" w:cs="Times New Roman"/>
+                <w:sz w:val="26"/>
+                <w:szCs w:val="26"/>
+              </w:rPr>
+              <w:t>Code Module Thanh toán, tạo Hóa đơn dịch vụ y tế</w:t>
+            </w:r>
+            <w:r>
+              <w:rPr>
+                <w:rFonts w:ascii="Times New Roman" w:hAnsi="Times New Roman" w:cs="Times New Roman"/>
+                <w:sz w:val="26"/>
+                <w:szCs w:val="26"/>
+              </w:rPr>
+              <w:t>.</w:t>
+            </w:r>
+          </w:p>
           <w:p>
             <w:pPr>
               <w:rPr>
@@ -15359,29 +17107,64 @@
           <w:tcPr>
             <w:tcW w:w="984" w:type="pct"/>
             <w:tcBorders>
-              <w:top w:val="dotted" w:sz="4" w:space="0" w:color="auto"/>
-              <w:bottom w:val="single" w:sz="4" w:space="0" w:color="auto"/>
-            </w:tcBorders>
-            <w:vAlign w:val="center"/>
-          </w:tcPr>
-          <w:p>
-            <w:pPr>
-              <w:rPr>
-                <w:rFonts w:ascii="Times New Roman" w:hAnsi="Times New Roman" w:cs="Times New Roman"/>
-                <w:sz w:val="26"/>
-                <w:szCs w:val="26"/>
-              </w:rPr>
-            </w:pPr>
+              <w:bottom w:val="dotted" w:sz="4" w:space="0" w:color="auto"/>
+            </w:tcBorders>
+            <w:vAlign w:val="center"/>
+          </w:tcPr>
+          <w:p>
+            <w:pPr>
+              <w:rPr>
+                <w:rFonts w:ascii="Times New Roman" w:hAnsi="Times New Roman" w:cs="Times New Roman"/>
+                <w:sz w:val="26"/>
+                <w:szCs w:val="26"/>
+              </w:rPr>
+            </w:pPr>
+            <w:r>
+              <w:rPr>
+                <w:rFonts w:ascii="Times New Roman" w:hAnsi="Times New Roman" w:cs="Times New Roman"/>
+                <w:sz w:val="26"/>
+                <w:szCs w:val="26"/>
+              </w:rPr>
+              <w:t>Nguyễn Minh Lý</w:t>
+            </w:r>
           </w:p>
         </w:tc>
         <w:tc>
           <w:tcPr>
             <w:tcW w:w="449" w:type="pct"/>
             <w:tcBorders>
-              <w:top w:val="dotted" w:sz="4" w:space="0" w:color="auto"/>
-              <w:bottom w:val="single" w:sz="4" w:space="0" w:color="auto"/>
-            </w:tcBorders>
-          </w:tcPr>
+              <w:bottom w:val="dotted" w:sz="4" w:space="0" w:color="auto"/>
+            </w:tcBorders>
+          </w:tcPr>
+          <w:p>
+            <w:pPr>
+              <w:rPr>
+                <w:rFonts w:ascii="Times New Roman" w:hAnsi="Times New Roman" w:cs="Times New Roman"/>
+                <w:sz w:val="26"/>
+                <w:szCs w:val="26"/>
+              </w:rPr>
+            </w:pPr>
+          </w:p>
+          <w:p>
+            <w:pPr>
+              <w:jc w:val="center"/>
+              <w:rPr>
+                <w:rFonts w:ascii="Times New Roman" w:hAnsi="Times New Roman" w:cs="Times New Roman"/>
+                <w:bCs/>
+                <w:sz w:val="26"/>
+                <w:szCs w:val="26"/>
+              </w:rPr>
+            </w:pPr>
+            <w:r>
+              <w:rPr>
+                <w:rFonts w:ascii="Times New Roman" w:hAnsi="Times New Roman" w:cs="Times New Roman"/>
+                <w:bCs/>
+                <w:sz w:val="26"/>
+                <w:szCs w:val="26"/>
+              </w:rPr>
+              <w:t>100%</w:t>
+            </w:r>
+          </w:p>
           <w:p>
             <w:pPr>
               <w:rPr>
@@ -15396,8 +17179,7 @@
           <w:tcPr>
             <w:tcW w:w="883" w:type="pct"/>
             <w:tcBorders>
-              <w:top w:val="dotted" w:sz="4" w:space="0" w:color="auto"/>
-              <w:bottom w:val="single" w:sz="4" w:space="0" w:color="auto"/>
+              <w:bottom w:val="dotted" w:sz="4" w:space="0" w:color="auto"/>
             </w:tcBorders>
           </w:tcPr>
           <w:p>
@@ -15414,8 +17196,7 @@
           <w:tcPr>
             <w:tcW w:w="707" w:type="pct"/>
             <w:tcBorders>
-              <w:top w:val="dotted" w:sz="4" w:space="0" w:color="auto"/>
-              <w:bottom w:val="single" w:sz="4" w:space="0" w:color="auto"/>
+              <w:bottom w:val="dotted" w:sz="4" w:space="0" w:color="auto"/>
             </w:tcBorders>
           </w:tcPr>
           <w:p>
@@ -15436,118 +17217,119 @@
         <w:tc>
           <w:tcPr>
             <w:tcW w:w="610" w:type="pct"/>
-            <w:vMerge w:val="restart"/>
-            <w:vAlign w:val="center"/>
-          </w:tcPr>
-          <w:p>
-            <w:pPr>
-              <w:rPr>
-                <w:rFonts w:ascii="Times New Roman" w:hAnsi="Times New Roman" w:cs="Times New Roman"/>
-                <w:sz w:val="26"/>
-                <w:szCs w:val="26"/>
-              </w:rPr>
-            </w:pPr>
-            <w:r>
+            <w:vMerge/>
+            <w:vAlign w:val="center"/>
+          </w:tcPr>
+          <w:p>
+            <w:pPr>
               <w:rPr>
                 <w:rFonts w:ascii="Times New Roman" w:hAnsi="Times New Roman" w:cs="Times New Roman"/>
                 <w:b/>
                 <w:sz w:val="26"/>
                 <w:szCs w:val="26"/>
               </w:rPr>
-              <w:t>Tuần 09</w:t>
-            </w:r>
-            <w:r>
-              <w:rPr>
-                <w:rFonts w:ascii="Times New Roman" w:hAnsi="Times New Roman" w:cs="Times New Roman"/>
-                <w:sz w:val="26"/>
-                <w:szCs w:val="26"/>
-              </w:rPr>
-              <w:t xml:space="preserve"> </w:t>
-            </w:r>
-          </w:p>
-          <w:p>
-            <w:pPr>
-              <w:rPr>
-                <w:rFonts w:ascii="Times New Roman" w:hAnsi="Times New Roman" w:cs="Times New Roman"/>
-                <w:sz w:val="26"/>
-                <w:szCs w:val="26"/>
-              </w:rPr>
-            </w:pPr>
-            <w:r>
-              <w:rPr>
-                <w:rFonts w:ascii="Times New Roman" w:hAnsi="Times New Roman" w:cs="Times New Roman"/>
-                <w:sz w:val="26"/>
-                <w:szCs w:val="26"/>
-              </w:rPr>
-              <w:t>(Từ</w:t>
-            </w:r>
-            <w:r>
-              <w:rPr>
-                <w:rFonts w:ascii="Times New Roman" w:hAnsi="Times New Roman" w:cs="Times New Roman"/>
-                <w:sz w:val="26"/>
-                <w:szCs w:val="26"/>
-              </w:rPr>
-              <w:t>:  ../../20</w:t>
-            </w:r>
-            <w:r>
-              <w:rPr>
-                <w:rFonts w:ascii="Times New Roman" w:hAnsi="Times New Roman" w:cs="Times New Roman"/>
-                <w:sz w:val="26"/>
-                <w:szCs w:val="26"/>
-              </w:rPr>
-              <w:t>26</w:t>
-            </w:r>
-          </w:p>
-          <w:p>
-            <w:pPr>
-              <w:rPr>
-                <w:rFonts w:ascii="Times New Roman" w:hAnsi="Times New Roman" w:cs="Times New Roman"/>
-                <w:sz w:val="26"/>
-                <w:szCs w:val="26"/>
-              </w:rPr>
-            </w:pPr>
-            <w:r>
-              <w:rPr>
-                <w:rFonts w:ascii="Times New Roman" w:hAnsi="Times New Roman" w:cs="Times New Roman"/>
-                <w:sz w:val="26"/>
-                <w:szCs w:val="26"/>
-              </w:rPr>
-              <w:t xml:space="preserve">Đến:  </w:t>
-            </w:r>
-            <w:r>
-              <w:rPr>
-                <w:rFonts w:ascii="Times New Roman" w:hAnsi="Times New Roman" w:cs="Times New Roman"/>
-                <w:sz w:val="26"/>
-                <w:szCs w:val="26"/>
-              </w:rPr>
-              <w:t>../../20</w:t>
-            </w:r>
-            <w:r>
-              <w:rPr>
-                <w:rFonts w:ascii="Times New Roman" w:hAnsi="Times New Roman" w:cs="Times New Roman"/>
-                <w:sz w:val="26"/>
-                <w:szCs w:val="26"/>
-              </w:rPr>
-              <w:t>26</w:t>
-            </w:r>
-            <w:r>
-              <w:rPr>
-                <w:rFonts w:ascii="Times New Roman" w:hAnsi="Times New Roman" w:cs="Times New Roman"/>
-                <w:sz w:val="26"/>
-                <w:szCs w:val="26"/>
-              </w:rPr>
-              <w:t>)</w:t>
-            </w:r>
+            </w:pPr>
           </w:p>
         </w:tc>
         <w:tc>
           <w:tcPr>
             <w:tcW w:w="1366" w:type="pct"/>
             <w:tcBorders>
-              <w:bottom w:val="dotted" w:sz="4" w:space="0" w:color="auto"/>
-            </w:tcBorders>
-            <w:vAlign w:val="center"/>
-          </w:tcPr>
+              <w:top w:val="dotted" w:sz="4" w:space="0" w:color="auto"/>
+              <w:bottom w:val="dotted" w:sz="4" w:space="0" w:color="auto"/>
+            </w:tcBorders>
+            <w:vAlign w:val="center"/>
+          </w:tcPr>
+          <w:p>
+            <w:pPr>
+              <w:rPr>
+                <w:rFonts w:ascii="Times New Roman" w:hAnsi="Times New Roman" w:cs="Times New Roman"/>
+                <w:sz w:val="26"/>
+                <w:szCs w:val="26"/>
+              </w:rPr>
+            </w:pPr>
+          </w:p>
+          <w:p>
+            <w:pPr>
+              <w:rPr>
+                <w:rFonts w:ascii="Times New Roman" w:hAnsi="Times New Roman" w:cs="Times New Roman"/>
+                <w:sz w:val="26"/>
+                <w:szCs w:val="26"/>
+              </w:rPr>
+            </w:pPr>
+            <w:r>
+              <w:rPr>
+                <w:rFonts w:ascii="Times New Roman" w:hAnsi="Times New Roman" w:cs="Times New Roman"/>
+                <w:sz w:val="26"/>
+                <w:szCs w:val="26"/>
+              </w:rPr>
+              <w:t>Lập trình các chức năng</w:t>
+            </w:r>
+            <w:r>
+              <w:rPr>
+                <w:rFonts w:ascii="Times New Roman" w:hAnsi="Times New Roman" w:cs="Times New Roman"/>
+                <w:sz w:val="26"/>
+                <w:szCs w:val="26"/>
+              </w:rPr>
+              <w:t xml:space="preserve"> d</w:t>
+            </w:r>
+            <w:r>
+              <w:rPr>
+                <w:rFonts w:ascii="Times New Roman" w:hAnsi="Times New Roman" w:cs="Times New Roman"/>
+                <w:sz w:val="26"/>
+                <w:szCs w:val="26"/>
+              </w:rPr>
+              <w:t>oanh thu</w:t>
+            </w:r>
+            <w:r>
+              <w:rPr>
+                <w:rFonts w:ascii="Times New Roman" w:hAnsi="Times New Roman" w:cs="Times New Roman"/>
+                <w:sz w:val="26"/>
+                <w:szCs w:val="26"/>
+              </w:rPr>
+              <w:t xml:space="preserve"> (Doanh thu</w:t>
+            </w:r>
+            <w:r>
+              <w:rPr>
+                <w:rFonts w:ascii="Times New Roman" w:hAnsi="Times New Roman" w:cs="Times New Roman"/>
+                <w:sz w:val="26"/>
+                <w:szCs w:val="26"/>
+              </w:rPr>
+              <w:t xml:space="preserve"> cá nhân</w:t>
+            </w:r>
+            <w:r>
+              <w:rPr>
+                <w:rFonts w:ascii="Times New Roman" w:hAnsi="Times New Roman" w:cs="Times New Roman"/>
+                <w:sz w:val="26"/>
+                <w:szCs w:val="26"/>
+              </w:rPr>
+              <w:t xml:space="preserve">, </w:t>
+            </w:r>
+            <w:r>
+              <w:rPr>
+                <w:rFonts w:ascii="Times New Roman" w:hAnsi="Times New Roman" w:cs="Times New Roman"/>
+                <w:sz w:val="26"/>
+                <w:szCs w:val="26"/>
+              </w:rPr>
+              <w:t>Thống kê d</w:t>
+            </w:r>
+            <w:r>
+              <w:rPr>
+                <w:rFonts w:ascii="Times New Roman" w:hAnsi="Times New Roman" w:cs="Times New Roman"/>
+                <w:sz w:val="26"/>
+                <w:szCs w:val="26"/>
+              </w:rPr>
+              <w:t>oanh thu</w:t>
+            </w:r>
+            <w:r>
+              <w:rPr>
+                <w:rFonts w:ascii="Times New Roman" w:hAnsi="Times New Roman" w:cs="Times New Roman"/>
+                <w:sz w:val="26"/>
+                <w:szCs w:val="26"/>
+              </w:rPr>
+              <w:t>).</w:t>
+            </w:r>
+          </w:p>
           <w:p>
             <w:pPr>
               <w:rPr>
@@ -15562,10 +17344,63 @@
           <w:tcPr>
             <w:tcW w:w="984" w:type="pct"/>
             <w:tcBorders>
-              <w:bottom w:val="dotted" w:sz="4" w:space="0" w:color="auto"/>
-            </w:tcBorders>
-            <w:vAlign w:val="center"/>
-          </w:tcPr>
+              <w:top w:val="dotted" w:sz="4" w:space="0" w:color="auto"/>
+              <w:bottom w:val="dotted" w:sz="4" w:space="0" w:color="auto"/>
+            </w:tcBorders>
+            <w:vAlign w:val="center"/>
+          </w:tcPr>
+          <w:p>
+            <w:pPr>
+              <w:rPr>
+                <w:rFonts w:ascii="Times New Roman" w:hAnsi="Times New Roman" w:cs="Times New Roman"/>
+                <w:sz w:val="26"/>
+                <w:szCs w:val="26"/>
+              </w:rPr>
+            </w:pPr>
+          </w:p>
+          <w:p>
+            <w:pPr>
+              <w:rPr>
+                <w:rFonts w:ascii="Times New Roman" w:hAnsi="Times New Roman" w:cs="Times New Roman"/>
+                <w:sz w:val="26"/>
+                <w:szCs w:val="26"/>
+              </w:rPr>
+            </w:pPr>
+            <w:r>
+              <w:rPr>
+                <w:rFonts w:ascii="Times New Roman" w:hAnsi="Times New Roman" w:cs="Times New Roman"/>
+                <w:sz w:val="26"/>
+                <w:szCs w:val="26"/>
+              </w:rPr>
+              <w:t>Nguyễn Khắc Duy</w:t>
+            </w:r>
+          </w:p>
+          <w:p>
+            <w:pPr>
+              <w:rPr>
+                <w:rFonts w:ascii="Times New Roman" w:hAnsi="Times New Roman" w:cs="Times New Roman"/>
+                <w:sz w:val="26"/>
+                <w:szCs w:val="26"/>
+              </w:rPr>
+            </w:pPr>
+          </w:p>
+          <w:p>
+            <w:pPr>
+              <w:rPr>
+                <w:rFonts w:ascii="Times New Roman" w:hAnsi="Times New Roman" w:cs="Times New Roman"/>
+                <w:sz w:val="26"/>
+                <w:szCs w:val="26"/>
+              </w:rPr>
+            </w:pPr>
+            <w:r>
+              <w:rPr>
+                <w:rFonts w:ascii="Times New Roman" w:hAnsi="Times New Roman" w:cs="Times New Roman"/>
+                <w:sz w:val="26"/>
+                <w:szCs w:val="26"/>
+              </w:rPr>
+              <w:t>Lê Trần Quang Thanh</w:t>
+            </w:r>
+          </w:p>
           <w:p>
             <w:pPr>
               <w:rPr>
@@ -15580,9 +17415,59 @@
           <w:tcPr>
             <w:tcW w:w="449" w:type="pct"/>
             <w:tcBorders>
-              <w:bottom w:val="dotted" w:sz="4" w:space="0" w:color="auto"/>
-            </w:tcBorders>
-          </w:tcPr>
+              <w:top w:val="dotted" w:sz="4" w:space="0" w:color="auto"/>
+              <w:bottom w:val="dotted" w:sz="4" w:space="0" w:color="auto"/>
+            </w:tcBorders>
+          </w:tcPr>
+          <w:p>
+            <w:pPr>
+              <w:rPr>
+                <w:rFonts w:ascii="Times New Roman" w:hAnsi="Times New Roman" w:cs="Times New Roman"/>
+                <w:sz w:val="26"/>
+                <w:szCs w:val="26"/>
+              </w:rPr>
+            </w:pPr>
+          </w:p>
+          <w:p>
+            <w:pPr>
+              <w:jc w:val="center"/>
+              <w:rPr>
+                <w:rFonts w:ascii="Times New Roman" w:hAnsi="Times New Roman" w:cs="Times New Roman"/>
+                <w:bCs/>
+                <w:sz w:val="26"/>
+                <w:szCs w:val="26"/>
+              </w:rPr>
+            </w:pPr>
+          </w:p>
+          <w:p>
+            <w:pPr>
+              <w:jc w:val="center"/>
+              <w:rPr>
+                <w:rFonts w:ascii="Times New Roman" w:hAnsi="Times New Roman" w:cs="Times New Roman"/>
+                <w:bCs/>
+                <w:sz w:val="26"/>
+                <w:szCs w:val="26"/>
+              </w:rPr>
+            </w:pPr>
+            <w:r>
+              <w:rPr>
+                <w:rFonts w:ascii="Times New Roman" w:hAnsi="Times New Roman" w:cs="Times New Roman"/>
+                <w:bCs/>
+                <w:sz w:val="26"/>
+                <w:szCs w:val="26"/>
+              </w:rPr>
+              <w:t>100%</w:t>
+            </w:r>
+          </w:p>
+          <w:p>
+            <w:pPr>
+              <w:rPr>
+                <w:rFonts w:ascii="Times New Roman" w:hAnsi="Times New Roman" w:cs="Times New Roman"/>
+                <w:sz w:val="26"/>
+                <w:szCs w:val="26"/>
+              </w:rPr>
+            </w:pPr>
+          </w:p>
           <w:p>
             <w:pPr>
               <w:rPr>
@@ -15597,6 +17482,7 @@
           <w:tcPr>
             <w:tcW w:w="883" w:type="pct"/>
             <w:tcBorders>
+              <w:top w:val="dotted" w:sz="4" w:space="0" w:color="auto"/>
               <w:bottom w:val="dotted" w:sz="4" w:space="0" w:color="auto"/>
             </w:tcBorders>
           </w:tcPr>
@@ -15614,6 +17500,7 @@
           <w:tcPr>
             <w:tcW w:w="707" w:type="pct"/>
             <w:tcBorders>
+              <w:top w:val="dotted" w:sz="4" w:space="0" w:color="auto"/>
               <w:bottom w:val="dotted" w:sz="4" w:space="0" w:color="auto"/>
             </w:tcBorders>
           </w:tcPr>
@@ -16908,7 +18795,7 @@
             <w:tcW w:w="1366" w:type="pct"/>
             <w:tcBorders>
               <w:top w:val="dotted" w:sz="4" w:space="0" w:color="auto"/>
-              <w:bottom w:val="dotted" w:sz="4" w:space="0" w:color="auto"/>
+              <w:bottom w:val="single" w:sz="4" w:space="0" w:color="auto"/>
             </w:tcBorders>
             <w:vAlign w:val="center"/>
           </w:tcPr>
@@ -16927,7 +18814,7 @@
             <w:tcW w:w="984" w:type="pct"/>
             <w:tcBorders>
               <w:top w:val="dotted" w:sz="4" w:space="0" w:color="auto"/>
-              <w:bottom w:val="dotted" w:sz="4" w:space="0" w:color="auto"/>
+              <w:bottom w:val="single" w:sz="4" w:space="0" w:color="auto"/>
             </w:tcBorders>
             <w:vAlign w:val="center"/>
           </w:tcPr>
@@ -16946,7 +18833,7 @@
             <w:tcW w:w="449" w:type="pct"/>
             <w:tcBorders>
               <w:top w:val="dotted" w:sz="4" w:space="0" w:color="auto"/>
-              <w:bottom w:val="dotted" w:sz="4" w:space="0" w:color="auto"/>
+              <w:bottom w:val="single" w:sz="4" w:space="0" w:color="auto"/>
             </w:tcBorders>
           </w:tcPr>
           <w:p>
@@ -16964,7 +18851,7 @@
             <w:tcW w:w="883" w:type="pct"/>
             <w:tcBorders>
               <w:top w:val="dotted" w:sz="4" w:space="0" w:color="auto"/>
-              <w:bottom w:val="dotted" w:sz="4" w:space="0" w:color="auto"/>
+              <w:bottom w:val="single" w:sz="4" w:space="0" w:color="auto"/>
             </w:tcBorders>
           </w:tcPr>
           <w:p>
@@ -16982,7 +18869,7 @@
             <w:tcW w:w="707" w:type="pct"/>
             <w:tcBorders>
               <w:top w:val="dotted" w:sz="4" w:space="0" w:color="auto"/>
-              <w:bottom w:val="dotted" w:sz="4" w:space="0" w:color="auto"/>
+              <w:bottom w:val="single" w:sz="4" w:space="0" w:color="auto"/>
             </w:tcBorders>
           </w:tcPr>
           <w:p>
@@ -17003,82 +18890,247 @@
         <w:tc>
           <w:tcPr>
             <w:tcW w:w="610" w:type="pct"/>
-            <w:vMerge/>
-            <w:vAlign w:val="center"/>
-          </w:tcPr>
-          <w:p>
-            <w:pPr>
+            <w:vMerge w:val="restart"/>
+            <w:vAlign w:val="center"/>
+          </w:tcPr>
+          <w:p>
+            <w:pPr>
+              <w:rPr>
+                <w:rFonts w:ascii="Times New Roman" w:hAnsi="Times New Roman" w:cs="Times New Roman"/>
+                <w:sz w:val="26"/>
+                <w:szCs w:val="26"/>
+              </w:rPr>
+            </w:pPr>
+            <w:r>
               <w:rPr>
                 <w:rFonts w:ascii="Times New Roman" w:hAnsi="Times New Roman" w:cs="Times New Roman"/>
                 <w:b/>
                 <w:sz w:val="26"/>
                 <w:szCs w:val="26"/>
               </w:rPr>
-            </w:pPr>
+              <w:t>Tuần 10</w:t>
+            </w:r>
+            <w:r>
+              <w:rPr>
+                <w:rFonts w:ascii="Times New Roman" w:hAnsi="Times New Roman" w:cs="Times New Roman"/>
+                <w:sz w:val="26"/>
+                <w:szCs w:val="26"/>
+              </w:rPr>
+              <w:t xml:space="preserve"> </w:t>
+            </w:r>
+          </w:p>
+          <w:p>
+            <w:pPr>
+              <w:rPr>
+                <w:rFonts w:ascii="Times New Roman" w:hAnsi="Times New Roman" w:cs="Times New Roman"/>
+                <w:sz w:val="26"/>
+                <w:szCs w:val="26"/>
+              </w:rPr>
+            </w:pPr>
+            <w:r>
+              <w:rPr>
+                <w:rFonts w:ascii="Times New Roman" w:hAnsi="Times New Roman" w:cs="Times New Roman"/>
+                <w:sz w:val="26"/>
+                <w:szCs w:val="26"/>
+              </w:rPr>
+              <w:t>(Từ</w:t>
+            </w:r>
+            <w:r>
+              <w:rPr>
+                <w:rFonts w:ascii="Times New Roman" w:hAnsi="Times New Roman" w:cs="Times New Roman"/>
+                <w:sz w:val="26"/>
+                <w:szCs w:val="26"/>
+              </w:rPr>
+              <w:t xml:space="preserve">:  </w:t>
+            </w:r>
+            <w:r>
+              <w:rPr>
+                <w:rFonts w:ascii="Times New Roman" w:hAnsi="Times New Roman" w:cs="Times New Roman"/>
+                <w:sz w:val="26"/>
+                <w:szCs w:val="26"/>
+              </w:rPr>
+              <w:t>12/10</w:t>
+            </w:r>
+            <w:r>
+              <w:rPr>
+                <w:rFonts w:ascii="Times New Roman" w:hAnsi="Times New Roman" w:cs="Times New Roman"/>
+                <w:sz w:val="26"/>
+                <w:szCs w:val="26"/>
+              </w:rPr>
+              <w:t>/2026</w:t>
+            </w:r>
+          </w:p>
+          <w:p>
+            <w:pPr>
+              <w:rPr>
+                <w:rFonts w:ascii="Times New Roman" w:hAnsi="Times New Roman" w:cs="Times New Roman"/>
+                <w:sz w:val="26"/>
+                <w:szCs w:val="26"/>
+              </w:rPr>
+            </w:pPr>
+            <w:r>
+              <w:rPr>
+                <w:rFonts w:ascii="Times New Roman" w:hAnsi="Times New Roman" w:cs="Times New Roman"/>
+                <w:sz w:val="26"/>
+                <w:szCs w:val="26"/>
+              </w:rPr>
+              <w:t xml:space="preserve">Đến:  </w:t>
+            </w:r>
+            <w:r>
+              <w:rPr>
+                <w:rFonts w:ascii="Times New Roman" w:hAnsi="Times New Roman" w:cs="Times New Roman"/>
+                <w:sz w:val="26"/>
+                <w:szCs w:val="26"/>
+              </w:rPr>
+              <w:t>18/10</w:t>
+            </w:r>
+            <w:r>
+              <w:rPr>
+                <w:rFonts w:ascii="Times New Roman" w:hAnsi="Times New Roman" w:cs="Times New Roman"/>
+                <w:sz w:val="26"/>
+                <w:szCs w:val="26"/>
+              </w:rPr>
+              <w:t>/2026</w:t>
+            </w:r>
+            <w:r>
+              <w:rPr>
+                <w:rFonts w:ascii="Times New Roman" w:hAnsi="Times New Roman" w:cs="Times New Roman"/>
+                <w:sz w:val="26"/>
+                <w:szCs w:val="26"/>
+              </w:rPr>
+              <w:t>)</w:t>
+            </w:r>
           </w:p>
         </w:tc>
         <w:tc>
           <w:tcPr>
             <w:tcW w:w="1366" w:type="pct"/>
             <w:tcBorders>
-              <w:top w:val="dotted" w:sz="4" w:space="0" w:color="auto"/>
-              <w:bottom w:val="single" w:sz="4" w:space="0" w:color="auto"/>
-            </w:tcBorders>
-            <w:vAlign w:val="center"/>
-          </w:tcPr>
-          <w:p>
-            <w:pPr>
-              <w:rPr>
-                <w:rFonts w:ascii="Times New Roman" w:hAnsi="Times New Roman" w:cs="Times New Roman"/>
-                <w:sz w:val="26"/>
-                <w:szCs w:val="26"/>
-              </w:rPr>
-            </w:pPr>
+              <w:bottom w:val="dotted" w:sz="4" w:space="0" w:color="auto"/>
+            </w:tcBorders>
+            <w:vAlign w:val="center"/>
+          </w:tcPr>
+          <w:p>
+            <w:pPr>
+              <w:rPr>
+                <w:rFonts w:ascii="Times New Roman" w:hAnsi="Times New Roman" w:cs="Times New Roman"/>
+                <w:sz w:val="26"/>
+                <w:szCs w:val="26"/>
+              </w:rPr>
+            </w:pPr>
+          </w:p>
+          <w:p>
+            <w:pPr>
+              <w:rPr>
+                <w:rFonts w:ascii="Times New Roman" w:hAnsi="Times New Roman" w:cs="Times New Roman"/>
+                <w:sz w:val="26"/>
+                <w:szCs w:val="26"/>
+              </w:rPr>
+            </w:pPr>
+            <w:r>
+              <w:rPr>
+                <w:rFonts w:ascii="Times New Roman" w:hAnsi="Times New Roman" w:cs="Times New Roman"/>
+                <w:sz w:val="26"/>
+                <w:szCs w:val="26"/>
+              </w:rPr>
+              <w:t xml:space="preserve">Tích hợp hệ thống (Integration): Ghép nối toàn bộ các module lại thành một luồng hoàn chỉnh từ lúc </w:t>
+            </w:r>
+          </w:p>
+          <w:p>
+            <w:pPr>
+              <w:rPr>
+                <w:rFonts w:ascii="Times New Roman" w:hAnsi="Times New Roman" w:cs="Times New Roman"/>
+                <w:sz w:val="26"/>
+                <w:szCs w:val="26"/>
+              </w:rPr>
+            </w:pPr>
+            <w:r>
+              <w:rPr>
+                <w:rFonts w:ascii="Times New Roman" w:hAnsi="Times New Roman" w:cs="Times New Roman"/>
+                <w:sz w:val="26"/>
+                <w:szCs w:val="26"/>
+              </w:rPr>
+              <w:t>Tiếp nhận đến Thanh toán.</w:t>
+            </w:r>
           </w:p>
         </w:tc>
         <w:tc>
           <w:tcPr>
             <w:tcW w:w="984" w:type="pct"/>
             <w:tcBorders>
-              <w:top w:val="dotted" w:sz="4" w:space="0" w:color="auto"/>
-              <w:bottom w:val="single" w:sz="4" w:space="0" w:color="auto"/>
-            </w:tcBorders>
-            <w:vAlign w:val="center"/>
-          </w:tcPr>
-          <w:p>
-            <w:pPr>
-              <w:rPr>
-                <w:rFonts w:ascii="Times New Roman" w:hAnsi="Times New Roman" w:cs="Times New Roman"/>
-                <w:sz w:val="26"/>
-                <w:szCs w:val="26"/>
-              </w:rPr>
-            </w:pPr>
+              <w:bottom w:val="dotted" w:sz="4" w:space="0" w:color="auto"/>
+            </w:tcBorders>
+            <w:vAlign w:val="center"/>
+          </w:tcPr>
+          <w:p>
+            <w:pPr>
+              <w:rPr>
+                <w:rFonts w:ascii="Times New Roman" w:hAnsi="Times New Roman" w:cs="Times New Roman"/>
+                <w:sz w:val="26"/>
+                <w:szCs w:val="26"/>
+              </w:rPr>
+            </w:pPr>
+            <w:r>
+              <w:rPr>
+                <w:rFonts w:ascii="Times New Roman" w:hAnsi="Times New Roman" w:cs="Times New Roman"/>
+                <w:sz w:val="26"/>
+                <w:szCs w:val="26"/>
+              </w:rPr>
+              <w:t>Tất cả thành viên</w:t>
+            </w:r>
           </w:p>
         </w:tc>
         <w:tc>
           <w:tcPr>
             <w:tcW w:w="449" w:type="pct"/>
             <w:tcBorders>
-              <w:top w:val="dotted" w:sz="4" w:space="0" w:color="auto"/>
-              <w:bottom w:val="single" w:sz="4" w:space="0" w:color="auto"/>
-            </w:tcBorders>
-          </w:tcPr>
-          <w:p>
-            <w:pPr>
-              <w:rPr>
-                <w:rFonts w:ascii="Times New Roman" w:hAnsi="Times New Roman" w:cs="Times New Roman"/>
-                <w:sz w:val="26"/>
-                <w:szCs w:val="26"/>
-              </w:rPr>
-            </w:pPr>
+              <w:bottom w:val="dotted" w:sz="4" w:space="0" w:color="auto"/>
+            </w:tcBorders>
+          </w:tcPr>
+          <w:p>
+            <w:pPr>
+              <w:rPr>
+                <w:rFonts w:ascii="Times New Roman" w:hAnsi="Times New Roman" w:cs="Times New Roman"/>
+                <w:sz w:val="26"/>
+                <w:szCs w:val="26"/>
+              </w:rPr>
+            </w:pPr>
+          </w:p>
+          <w:p>
+            <w:pPr>
+              <w:rPr>
+                <w:rFonts w:ascii="Times New Roman" w:hAnsi="Times New Roman" w:cs="Times New Roman"/>
+                <w:sz w:val="26"/>
+                <w:szCs w:val="26"/>
+              </w:rPr>
+            </w:pPr>
+          </w:p>
+          <w:p>
+            <w:pPr>
+              <w:jc w:val="center"/>
+              <w:rPr>
+                <w:rFonts w:ascii="Times New Roman" w:hAnsi="Times New Roman" w:cs="Times New Roman"/>
+                <w:bCs/>
+                <w:sz w:val="26"/>
+                <w:szCs w:val="26"/>
+              </w:rPr>
+            </w:pPr>
+            <w:r>
+              <w:rPr>
+                <w:rFonts w:ascii="Times New Roman" w:hAnsi="Times New Roman" w:cs="Times New Roman"/>
+                <w:bCs/>
+                <w:sz w:val="26"/>
+                <w:szCs w:val="26"/>
+              </w:rPr>
+              <w:t>100%</w:t>
+            </w:r>
           </w:p>
         </w:tc>
         <w:tc>
           <w:tcPr>
             <w:tcW w:w="883" w:type="pct"/>
             <w:tcBorders>
-              <w:top w:val="dotted" w:sz="4" w:space="0" w:color="auto"/>
-              <w:bottom w:val="single" w:sz="4" w:space="0" w:color="auto"/>
+              <w:bottom w:val="dotted" w:sz="4" w:space="0" w:color="auto"/>
             </w:tcBorders>
           </w:tcPr>
           <w:p>
@@ -17095,18 +19147,25 @@
           <w:tcPr>
             <w:tcW w:w="707" w:type="pct"/>
             <w:tcBorders>
-              <w:top w:val="dotted" w:sz="4" w:space="0" w:color="auto"/>
-              <w:bottom w:val="single" w:sz="4" w:space="0" w:color="auto"/>
-            </w:tcBorders>
-          </w:tcPr>
-          <w:p>
-            <w:pPr>
-              <w:rPr>
-                <w:rFonts w:ascii="Times New Roman" w:hAnsi="Times New Roman" w:cs="Times New Roman"/>
-                <w:sz w:val="26"/>
-                <w:szCs w:val="26"/>
-              </w:rPr>
-            </w:pPr>
+              <w:bottom w:val="dotted" w:sz="4" w:space="0" w:color="auto"/>
+            </w:tcBorders>
+          </w:tcPr>
+          <w:p>
+            <w:pPr>
+              <w:rPr>
+                <w:rFonts w:ascii="Times New Roman" w:hAnsi="Times New Roman" w:cs="Times New Roman"/>
+                <w:sz w:val="26"/>
+                <w:szCs w:val="26"/>
+              </w:rPr>
+            </w:pPr>
+            <w:r>
+              <w:rPr>
+                <w:rFonts w:ascii="Times New Roman" w:hAnsi="Times New Roman" w:cs="Times New Roman"/>
+                <w:sz w:val="26"/>
+                <w:szCs w:val="26"/>
+              </w:rPr>
+              <w:t>Giải quyết conflict trên GitHub</w:t>
+            </w:r>
           </w:p>
         </w:tc>
       </w:tr>
@@ -17117,136 +19176,116 @@
         <w:tc>
           <w:tcPr>
             <w:tcW w:w="610" w:type="pct"/>
-            <w:vMerge w:val="restart"/>
-            <w:vAlign w:val="center"/>
-          </w:tcPr>
-          <w:p>
-            <w:pPr>
-              <w:rPr>
-                <w:rFonts w:ascii="Times New Roman" w:hAnsi="Times New Roman" w:cs="Times New Roman"/>
-                <w:sz w:val="26"/>
-                <w:szCs w:val="26"/>
-              </w:rPr>
-            </w:pPr>
-            <w:r>
+            <w:vMerge/>
+            <w:vAlign w:val="center"/>
+          </w:tcPr>
+          <w:p>
+            <w:pPr>
               <w:rPr>
                 <w:rFonts w:ascii="Times New Roman" w:hAnsi="Times New Roman" w:cs="Times New Roman"/>
                 <w:b/>
                 <w:sz w:val="26"/>
                 <w:szCs w:val="26"/>
               </w:rPr>
-              <w:t>Tuần 10</w:t>
-            </w:r>
-            <w:r>
-              <w:rPr>
-                <w:rFonts w:ascii="Times New Roman" w:hAnsi="Times New Roman" w:cs="Times New Roman"/>
-                <w:sz w:val="26"/>
-                <w:szCs w:val="26"/>
-              </w:rPr>
-              <w:t xml:space="preserve"> </w:t>
-            </w:r>
-          </w:p>
-          <w:p>
-            <w:pPr>
-              <w:rPr>
-                <w:rFonts w:ascii="Times New Roman" w:hAnsi="Times New Roman" w:cs="Times New Roman"/>
-                <w:sz w:val="26"/>
-                <w:szCs w:val="26"/>
-              </w:rPr>
-            </w:pPr>
-            <w:r>
-              <w:rPr>
-                <w:rFonts w:ascii="Times New Roman" w:hAnsi="Times New Roman" w:cs="Times New Roman"/>
-                <w:sz w:val="26"/>
-                <w:szCs w:val="26"/>
-              </w:rPr>
-              <w:t>(Từ</w:t>
-            </w:r>
-            <w:r>
-              <w:rPr>
-                <w:rFonts w:ascii="Times New Roman" w:hAnsi="Times New Roman" w:cs="Times New Roman"/>
-                <w:sz w:val="26"/>
-                <w:szCs w:val="26"/>
-              </w:rPr>
-              <w:t>:  ../../20</w:t>
-            </w:r>
-            <w:r>
-              <w:rPr>
-                <w:rFonts w:ascii="Times New Roman" w:hAnsi="Times New Roman" w:cs="Times New Roman"/>
-                <w:sz w:val="26"/>
-                <w:szCs w:val="26"/>
-              </w:rPr>
-              <w:t>26</w:t>
-            </w:r>
-          </w:p>
-          <w:p>
-            <w:pPr>
-              <w:rPr>
-                <w:rFonts w:ascii="Times New Roman" w:hAnsi="Times New Roman" w:cs="Times New Roman"/>
-                <w:sz w:val="26"/>
-                <w:szCs w:val="26"/>
-              </w:rPr>
-            </w:pPr>
-            <w:r>
-              <w:rPr>
-                <w:rFonts w:ascii="Times New Roman" w:hAnsi="Times New Roman" w:cs="Times New Roman"/>
-                <w:sz w:val="26"/>
-                <w:szCs w:val="26"/>
-              </w:rPr>
-              <w:t xml:space="preserve">Đến:  </w:t>
-            </w:r>
-            <w:r>
-              <w:rPr>
-                <w:rFonts w:ascii="Times New Roman" w:hAnsi="Times New Roman" w:cs="Times New Roman"/>
-                <w:sz w:val="26"/>
-                <w:szCs w:val="26"/>
-              </w:rPr>
-              <w:t>../../20</w:t>
-            </w:r>
-            <w:r>
-              <w:rPr>
-                <w:rFonts w:ascii="Times New Roman" w:hAnsi="Times New Roman" w:cs="Times New Roman"/>
-                <w:sz w:val="26"/>
-                <w:szCs w:val="26"/>
-              </w:rPr>
-              <w:t>26</w:t>
-            </w:r>
-            <w:r>
-              <w:rPr>
-                <w:rFonts w:ascii="Times New Roman" w:hAnsi="Times New Roman" w:cs="Times New Roman"/>
-                <w:sz w:val="26"/>
-                <w:szCs w:val="26"/>
-              </w:rPr>
-              <w:t>)</w:t>
-            </w:r>
+            </w:pPr>
           </w:p>
         </w:tc>
         <w:tc>
           <w:tcPr>
             <w:tcW w:w="1366" w:type="pct"/>
             <w:tcBorders>
-              <w:bottom w:val="dotted" w:sz="4" w:space="0" w:color="auto"/>
-            </w:tcBorders>
-            <w:vAlign w:val="center"/>
-          </w:tcPr>
-          <w:p>
-            <w:pPr>
-              <w:rPr>
-                <w:rFonts w:ascii="Times New Roman" w:hAnsi="Times New Roman" w:cs="Times New Roman"/>
-                <w:sz w:val="26"/>
-                <w:szCs w:val="26"/>
-              </w:rPr>
-            </w:pPr>
+              <w:top w:val="dotted" w:sz="4" w:space="0" w:color="auto"/>
+              <w:bottom w:val="dotted" w:sz="4" w:space="0" w:color="auto"/>
+            </w:tcBorders>
+            <w:vAlign w:val="center"/>
+          </w:tcPr>
+          <w:p>
+            <w:pPr>
+              <w:rPr>
+                <w:rFonts w:ascii="Times New Roman" w:hAnsi="Times New Roman" w:cs="Times New Roman"/>
+                <w:sz w:val="26"/>
+                <w:szCs w:val="26"/>
+              </w:rPr>
+            </w:pPr>
+            <w:r>
+              <w:rPr>
+                <w:rFonts w:ascii="Times New Roman" w:hAnsi="Times New Roman" w:cs="Times New Roman"/>
+                <w:sz w:val="26"/>
+                <w:szCs w:val="26"/>
+              </w:rPr>
+              <w:t>Kiểm tra luồng dữ liệu (Data flow) xuyên suốt ứng dụng. Đóng gói bản báo cáo tiến độ giữa kỳ</w:t>
+            </w:r>
+            <w:r>
+              <w:rPr>
+                <w:rFonts w:ascii="Times New Roman" w:hAnsi="Times New Roman" w:cs="Times New Roman"/>
+                <w:sz w:val="26"/>
+                <w:szCs w:val="26"/>
+              </w:rPr>
+              <w:t>.</w:t>
+            </w:r>
           </w:p>
         </w:tc>
         <w:tc>
           <w:tcPr>
             <w:tcW w:w="984" w:type="pct"/>
             <w:tcBorders>
-              <w:bottom w:val="dotted" w:sz="4" w:space="0" w:color="auto"/>
-            </w:tcBorders>
-            <w:vAlign w:val="center"/>
-          </w:tcPr>
+              <w:top w:val="dotted" w:sz="4" w:space="0" w:color="auto"/>
+              <w:bottom w:val="dotted" w:sz="4" w:space="0" w:color="auto"/>
+            </w:tcBorders>
+            <w:vAlign w:val="center"/>
+          </w:tcPr>
+          <w:p>
+            <w:pPr>
+              <w:rPr>
+                <w:rFonts w:ascii="Times New Roman" w:hAnsi="Times New Roman" w:cs="Times New Roman"/>
+                <w:sz w:val="26"/>
+                <w:szCs w:val="26"/>
+              </w:rPr>
+            </w:pPr>
+          </w:p>
+          <w:p>
+            <w:pPr>
+              <w:rPr>
+                <w:rFonts w:ascii="Times New Roman" w:hAnsi="Times New Roman" w:cs="Times New Roman"/>
+                <w:sz w:val="26"/>
+                <w:szCs w:val="26"/>
+              </w:rPr>
+            </w:pPr>
+            <w:r>
+              <w:rPr>
+                <w:rFonts w:ascii="Times New Roman" w:hAnsi="Times New Roman" w:cs="Times New Roman"/>
+                <w:sz w:val="26"/>
+                <w:szCs w:val="26"/>
+              </w:rPr>
+              <w:t>Nguyễn Minh Thuận</w:t>
+            </w:r>
+          </w:p>
+          <w:p>
+            <w:pPr>
+              <w:rPr>
+                <w:rFonts w:ascii="Times New Roman" w:hAnsi="Times New Roman" w:cs="Times New Roman"/>
+                <w:sz w:val="26"/>
+                <w:szCs w:val="26"/>
+              </w:rPr>
+            </w:pPr>
+          </w:p>
+          <w:p>
+            <w:pPr>
+              <w:rPr>
+                <w:rFonts w:ascii="Times New Roman" w:hAnsi="Times New Roman" w:cs="Times New Roman"/>
+                <w:sz w:val="26"/>
+                <w:szCs w:val="26"/>
+              </w:rPr>
+            </w:pPr>
+            <w:r>
+              <w:rPr>
+                <w:rFonts w:ascii="Times New Roman" w:hAnsi="Times New Roman" w:cs="Times New Roman"/>
+                <w:sz w:val="26"/>
+                <w:szCs w:val="26"/>
+              </w:rPr>
+              <w:t>Lê Trần Quang Thanh</w:t>
+            </w:r>
+          </w:p>
           <w:p>
             <w:pPr>
               <w:rPr>
@@ -17261,23 +19300,53 @@
           <w:tcPr>
             <w:tcW w:w="449" w:type="pct"/>
             <w:tcBorders>
-              <w:bottom w:val="dotted" w:sz="4" w:space="0" w:color="auto"/>
-            </w:tcBorders>
-          </w:tcPr>
-          <w:p>
-            <w:pPr>
-              <w:rPr>
-                <w:rFonts w:ascii="Times New Roman" w:hAnsi="Times New Roman" w:cs="Times New Roman"/>
-                <w:sz w:val="26"/>
-                <w:szCs w:val="26"/>
-              </w:rPr>
-            </w:pPr>
+              <w:top w:val="dotted" w:sz="4" w:space="0" w:color="auto"/>
+              <w:bottom w:val="dotted" w:sz="4" w:space="0" w:color="auto"/>
+            </w:tcBorders>
+          </w:tcPr>
+          <w:p>
+            <w:pPr>
+              <w:rPr>
+                <w:rFonts w:ascii="Times New Roman" w:hAnsi="Times New Roman" w:cs="Times New Roman"/>
+                <w:sz w:val="26"/>
+                <w:szCs w:val="26"/>
+              </w:rPr>
+            </w:pPr>
+          </w:p>
+          <w:p>
+            <w:pPr>
+              <w:rPr>
+                <w:rFonts w:ascii="Times New Roman" w:hAnsi="Times New Roman" w:cs="Times New Roman"/>
+                <w:sz w:val="26"/>
+                <w:szCs w:val="26"/>
+              </w:rPr>
+            </w:pPr>
+          </w:p>
+          <w:p>
+            <w:pPr>
+              <w:jc w:val="center"/>
+              <w:rPr>
+                <w:rFonts w:ascii="Times New Roman" w:hAnsi="Times New Roman" w:cs="Times New Roman"/>
+                <w:sz w:val="26"/>
+                <w:szCs w:val="26"/>
+              </w:rPr>
+            </w:pPr>
+            <w:r>
+              <w:rPr>
+                <w:rFonts w:ascii="Times New Roman" w:hAnsi="Times New Roman" w:cs="Times New Roman"/>
+                <w:bCs/>
+                <w:sz w:val="26"/>
+                <w:szCs w:val="26"/>
+              </w:rPr>
+              <w:t>100%</w:t>
+            </w:r>
           </w:p>
         </w:tc>
         <w:tc>
           <w:tcPr>
             <w:tcW w:w="883" w:type="pct"/>
             <w:tcBorders>
+              <w:top w:val="dotted" w:sz="4" w:space="0" w:color="auto"/>
               <w:bottom w:val="dotted" w:sz="4" w:space="0" w:color="auto"/>
             </w:tcBorders>
           </w:tcPr>
@@ -17295,6 +19364,7 @@
           <w:tcPr>
             <w:tcW w:w="707" w:type="pct"/>
             <w:tcBorders>
+              <w:top w:val="dotted" w:sz="4" w:space="0" w:color="auto"/>
               <w:bottom w:val="dotted" w:sz="4" w:space="0" w:color="auto"/>
             </w:tcBorders>
           </w:tcPr>
@@ -18589,124 +20659,28 @@
             <w:tcW w:w="1366" w:type="pct"/>
             <w:tcBorders>
               <w:top w:val="dotted" w:sz="4" w:space="0" w:color="auto"/>
-              <w:bottom w:val="dotted" w:sz="4" w:space="0" w:color="auto"/>
-            </w:tcBorders>
-            <w:vAlign w:val="center"/>
-          </w:tcPr>
-          <w:p>
-            <w:pPr>
-              <w:rPr>
-                <w:rFonts w:ascii="Times New Roman" w:hAnsi="Times New Roman" w:cs="Times New Roman"/>
-                <w:sz w:val="26"/>
-                <w:szCs w:val="26"/>
-              </w:rPr>
-            </w:pPr>
-          </w:p>
-        </w:tc>
-        <w:tc>
-          <w:tcPr>
-            <w:tcW w:w="984" w:type="pct"/>
-            <w:tcBorders>
-              <w:top w:val="dotted" w:sz="4" w:space="0" w:color="auto"/>
-              <w:bottom w:val="dotted" w:sz="4" w:space="0" w:color="auto"/>
-            </w:tcBorders>
-            <w:vAlign w:val="center"/>
-          </w:tcPr>
-          <w:p>
-            <w:pPr>
-              <w:rPr>
-                <w:rFonts w:ascii="Times New Roman" w:hAnsi="Times New Roman" w:cs="Times New Roman"/>
-                <w:sz w:val="26"/>
-                <w:szCs w:val="26"/>
-              </w:rPr>
-            </w:pPr>
-          </w:p>
-        </w:tc>
-        <w:tc>
-          <w:tcPr>
-            <w:tcW w:w="449" w:type="pct"/>
-            <w:tcBorders>
-              <w:top w:val="dotted" w:sz="4" w:space="0" w:color="auto"/>
-              <w:bottom w:val="dotted" w:sz="4" w:space="0" w:color="auto"/>
-            </w:tcBorders>
-          </w:tcPr>
-          <w:p>
-            <w:pPr>
-              <w:rPr>
-                <w:rFonts w:ascii="Times New Roman" w:hAnsi="Times New Roman" w:cs="Times New Roman"/>
-                <w:sz w:val="26"/>
-                <w:szCs w:val="26"/>
-              </w:rPr>
-            </w:pPr>
-          </w:p>
-        </w:tc>
-        <w:tc>
-          <w:tcPr>
-            <w:tcW w:w="883" w:type="pct"/>
-            <w:tcBorders>
-              <w:top w:val="dotted" w:sz="4" w:space="0" w:color="auto"/>
-              <w:bottom w:val="dotted" w:sz="4" w:space="0" w:color="auto"/>
-            </w:tcBorders>
-          </w:tcPr>
-          <w:p>
-            <w:pPr>
-              <w:rPr>
-                <w:rFonts w:ascii="Times New Roman" w:hAnsi="Times New Roman" w:cs="Times New Roman"/>
-                <w:sz w:val="26"/>
-                <w:szCs w:val="26"/>
-              </w:rPr>
-            </w:pPr>
-          </w:p>
-        </w:tc>
-        <w:tc>
-          <w:tcPr>
-            <w:tcW w:w="707" w:type="pct"/>
-            <w:tcBorders>
-              <w:top w:val="dotted" w:sz="4" w:space="0" w:color="auto"/>
-              <w:bottom w:val="dotted" w:sz="4" w:space="0" w:color="auto"/>
-            </w:tcBorders>
-          </w:tcPr>
-          <w:p>
-            <w:pPr>
-              <w:rPr>
-                <w:rFonts w:ascii="Times New Roman" w:hAnsi="Times New Roman" w:cs="Times New Roman"/>
-                <w:sz w:val="26"/>
-                <w:szCs w:val="26"/>
-              </w:rPr>
-            </w:pPr>
-          </w:p>
-        </w:tc>
-      </w:tr>
-      <w:tr>
-        <w:trPr>
-          <w:trHeight w:val="340"/>
-        </w:trPr>
-        <w:tc>
-          <w:tcPr>
-            <w:tcW w:w="610" w:type="pct"/>
-            <w:vMerge/>
-            <w:vAlign w:val="center"/>
-          </w:tcPr>
-          <w:p>
-            <w:pPr>
-              <w:rPr>
-                <w:rFonts w:ascii="Times New Roman" w:hAnsi="Times New Roman" w:cs="Times New Roman"/>
-                <w:b/>
-                <w:sz w:val="26"/>
-                <w:szCs w:val="26"/>
-              </w:rPr>
-            </w:pPr>
-          </w:p>
-        </w:tc>
-        <w:tc>
-          <w:tcPr>
-            <w:tcW w:w="1366" w:type="pct"/>
-            <w:tcBorders>
-              <w:top w:val="dotted" w:sz="4" w:space="0" w:color="auto"/>
               <w:bottom w:val="single" w:sz="4" w:space="0" w:color="auto"/>
             </w:tcBorders>
             <w:vAlign w:val="center"/>
           </w:tcPr>
+          <w:p>
+            <w:pPr>
+              <w:rPr>
+                <w:rFonts w:ascii="Times New Roman" w:hAnsi="Times New Roman" w:cs="Times New Roman"/>
+                <w:sz w:val="26"/>
+                <w:szCs w:val="26"/>
+              </w:rPr>
+            </w:pPr>
+          </w:p>
+          <w:p>
+            <w:pPr>
+              <w:rPr>
+                <w:rFonts w:ascii="Times New Roman" w:hAnsi="Times New Roman" w:cs="Times New Roman"/>
+                <w:sz w:val="26"/>
+                <w:szCs w:val="26"/>
+              </w:rPr>
+            </w:pPr>
+          </w:p>
           <w:p>
             <w:pPr>
               <w:rPr>
@@ -18817,6 +20791,7 @@
                 <w:sz w:val="26"/>
                 <w:szCs w:val="26"/>
               </w:rPr>
+              <w:lastRenderedPageBreak/>
               <w:t xml:space="preserve">Tuần 11 </w:t>
             </w:r>
           </w:p>
@@ -18842,15 +20817,23 @@
                 <w:sz w:val="26"/>
                 <w:szCs w:val="26"/>
               </w:rPr>
-              <w:t>:  ../../20</w:t>
-            </w:r>
-            <w:r>
-              <w:rPr>
-                <w:rFonts w:ascii="Times New Roman" w:hAnsi="Times New Roman" w:cs="Times New Roman"/>
-                <w:sz w:val="26"/>
-                <w:szCs w:val="26"/>
-              </w:rPr>
-              <w:t>26</w:t>
+              <w:t xml:space="preserve">:  </w:t>
+            </w:r>
+            <w:r>
+              <w:rPr>
+                <w:rFonts w:ascii="Times New Roman" w:hAnsi="Times New Roman" w:cs="Times New Roman"/>
+                <w:sz w:val="26"/>
+                <w:szCs w:val="26"/>
+              </w:rPr>
+              <w:t>19/10</w:t>
+            </w:r>
+            <w:r>
+              <w:rPr>
+                <w:rFonts w:ascii="Times New Roman" w:hAnsi="Times New Roman" w:cs="Times New Roman"/>
+                <w:sz w:val="26"/>
+                <w:szCs w:val="26"/>
+              </w:rPr>
+              <w:t>/2026</w:t>
             </w:r>
           </w:p>
           <w:p>
@@ -18875,15 +20858,15 @@
                 <w:sz w:val="26"/>
                 <w:szCs w:val="26"/>
               </w:rPr>
-              <w:t>../../20</w:t>
-            </w:r>
-            <w:r>
-              <w:rPr>
-                <w:rFonts w:ascii="Times New Roman" w:hAnsi="Times New Roman" w:cs="Times New Roman"/>
-                <w:sz w:val="26"/>
-                <w:szCs w:val="26"/>
-              </w:rPr>
-              <w:t>26</w:t>
+              <w:t>25/10</w:t>
+            </w:r>
+            <w:r>
+              <w:rPr>
+                <w:rFonts w:ascii="Times New Roman" w:hAnsi="Times New Roman" w:cs="Times New Roman"/>
+                <w:sz w:val="26"/>
+                <w:szCs w:val="26"/>
+              </w:rPr>
+              <w:t>/2026</w:t>
             </w:r>
             <w:r>
               <w:rPr>
@@ -18911,6 +20894,14 @@
                 <w:szCs w:val="26"/>
               </w:rPr>
             </w:pPr>
+            <w:r>
+              <w:rPr>
+                <w:rFonts w:ascii="Times New Roman" w:hAnsi="Times New Roman" w:cs="Times New Roman"/>
+                <w:sz w:val="26"/>
+                <w:szCs w:val="26"/>
+              </w:rPr>
+              <w:t>Kiểm thử đợt 1: Viết Test Case cho các chức năng chính. Tiến hành Unit Test và System Test.</w:t>
+            </w:r>
           </w:p>
         </w:tc>
         <w:tc>
@@ -18929,6 +20920,14 @@
                 <w:szCs w:val="26"/>
               </w:rPr>
             </w:pPr>
+            <w:r>
+              <w:rPr>
+                <w:rFonts w:ascii="Times New Roman" w:hAnsi="Times New Roman" w:cs="Times New Roman"/>
+                <w:sz w:val="26"/>
+                <w:szCs w:val="26"/>
+              </w:rPr>
+              <w:t>Tất cả thành viên</w:t>
+            </w:r>
           </w:p>
         </w:tc>
         <w:tc>
@@ -18946,6 +20945,25 @@
                 <w:szCs w:val="26"/>
               </w:rPr>
             </w:pPr>
+          </w:p>
+          <w:p>
+            <w:pPr>
+              <w:jc w:val="center"/>
+              <w:rPr>
+                <w:rFonts w:ascii="Times New Roman" w:hAnsi="Times New Roman" w:cs="Times New Roman"/>
+                <w:sz w:val="26"/>
+                <w:szCs w:val="26"/>
+              </w:rPr>
+            </w:pPr>
+            <w:r>
+              <w:rPr>
+                <w:rFonts w:ascii="Times New Roman" w:hAnsi="Times New Roman" w:cs="Times New Roman"/>
+                <w:bCs/>
+                <w:sz w:val="26"/>
+                <w:szCs w:val="26"/>
+              </w:rPr>
+              <w:t>100%</w:t>
+            </w:r>
           </w:p>
         </w:tc>
         <w:tc>
@@ -19021,6 +21039,14 @@
                 <w:szCs w:val="26"/>
               </w:rPr>
             </w:pPr>
+            <w:r>
+              <w:rPr>
+                <w:rFonts w:ascii="Times New Roman" w:hAnsi="Times New Roman" w:cs="Times New Roman"/>
+                <w:sz w:val="26"/>
+                <w:szCs w:val="26"/>
+              </w:rPr>
+              <w:t>Fix các lỗi bug giao diện, bug logic, lỗi kết nối Database phát sinh trong lúc kiểm thử.</w:t>
+            </w:r>
           </w:p>
         </w:tc>
         <w:tc>
@@ -19040,6 +21066,74 @@
                 <w:szCs w:val="26"/>
               </w:rPr>
             </w:pPr>
+            <w:r>
+              <w:rPr>
+                <w:rFonts w:ascii="Times New Roman" w:hAnsi="Times New Roman" w:cs="Times New Roman"/>
+                <w:sz w:val="26"/>
+                <w:szCs w:val="26"/>
+              </w:rPr>
+              <w:t>Lê Trần Quang Thanh</w:t>
+            </w:r>
+            <w:r>
+              <w:rPr>
+                <w:rFonts w:ascii="Times New Roman" w:hAnsi="Times New Roman" w:cs="Times New Roman"/>
+                <w:sz w:val="26"/>
+                <w:szCs w:val="26"/>
+              </w:rPr>
+              <w:br/>
+            </w:r>
+          </w:p>
+          <w:p>
+            <w:pPr>
+              <w:rPr>
+                <w:rFonts w:ascii="Times New Roman" w:hAnsi="Times New Roman" w:cs="Times New Roman"/>
+                <w:sz w:val="26"/>
+                <w:szCs w:val="26"/>
+              </w:rPr>
+            </w:pPr>
+            <w:r>
+              <w:rPr>
+                <w:rFonts w:ascii="Times New Roman" w:hAnsi="Times New Roman" w:cs="Times New Roman"/>
+                <w:sz w:val="26"/>
+                <w:szCs w:val="26"/>
+              </w:rPr>
+              <w:t>Nguyễn Minh Thuận</w:t>
+            </w:r>
+          </w:p>
+          <w:p>
+            <w:pPr>
+              <w:rPr>
+                <w:rFonts w:ascii="Times New Roman" w:hAnsi="Times New Roman" w:cs="Times New Roman"/>
+                <w:sz w:val="26"/>
+                <w:szCs w:val="26"/>
+              </w:rPr>
+            </w:pPr>
+          </w:p>
+          <w:p>
+            <w:pPr>
+              <w:rPr>
+                <w:rFonts w:ascii="Times New Roman" w:hAnsi="Times New Roman" w:cs="Times New Roman"/>
+                <w:sz w:val="26"/>
+                <w:szCs w:val="26"/>
+              </w:rPr>
+            </w:pPr>
+            <w:r>
+              <w:rPr>
+                <w:rFonts w:ascii="Times New Roman" w:hAnsi="Times New Roman" w:cs="Times New Roman"/>
+                <w:sz w:val="26"/>
+                <w:szCs w:val="26"/>
+              </w:rPr>
+              <w:t>Nguyễn Khắc Duy</w:t>
+            </w:r>
+          </w:p>
+          <w:p>
+            <w:pPr>
+              <w:rPr>
+                <w:rFonts w:ascii="Times New Roman" w:hAnsi="Times New Roman" w:cs="Times New Roman"/>
+                <w:sz w:val="26"/>
+                <w:szCs w:val="26"/>
+              </w:rPr>
+            </w:pPr>
           </w:p>
         </w:tc>
         <w:tc>
@@ -19058,6 +21152,34 @@
                 <w:szCs w:val="26"/>
               </w:rPr>
             </w:pPr>
+          </w:p>
+          <w:p>
+            <w:pPr>
+              <w:rPr>
+                <w:rFonts w:ascii="Times New Roman" w:hAnsi="Times New Roman" w:cs="Times New Roman"/>
+                <w:sz w:val="26"/>
+                <w:szCs w:val="26"/>
+              </w:rPr>
+            </w:pPr>
+          </w:p>
+          <w:p>
+            <w:pPr>
+              <w:jc w:val="center"/>
+              <w:rPr>
+                <w:rFonts w:ascii="Times New Roman" w:hAnsi="Times New Roman" w:cs="Times New Roman"/>
+                <w:sz w:val="26"/>
+                <w:szCs w:val="26"/>
+              </w:rPr>
+            </w:pPr>
+            <w:r>
+              <w:rPr>
+                <w:rFonts w:ascii="Times New Roman" w:hAnsi="Times New Roman" w:cs="Times New Roman"/>
+                <w:bCs/>
+                <w:sz w:val="26"/>
+                <w:szCs w:val="26"/>
+              </w:rPr>
+              <w:t>100%</w:t>
+            </w:r>
           </w:p>
         </w:tc>
         <w:tc>
@@ -20643,15 +22765,23 @@
                 <w:sz w:val="26"/>
                 <w:szCs w:val="26"/>
               </w:rPr>
-              <w:t>:  ../../20</w:t>
-            </w:r>
-            <w:r>
-              <w:rPr>
-                <w:rFonts w:ascii="Times New Roman" w:hAnsi="Times New Roman" w:cs="Times New Roman"/>
-                <w:sz w:val="26"/>
-                <w:szCs w:val="26"/>
-              </w:rPr>
-              <w:t>26</w:t>
+              <w:t xml:space="preserve">:  </w:t>
+            </w:r>
+            <w:r>
+              <w:rPr>
+                <w:rFonts w:ascii="Times New Roman" w:hAnsi="Times New Roman" w:cs="Times New Roman"/>
+                <w:sz w:val="26"/>
+                <w:szCs w:val="26"/>
+              </w:rPr>
+              <w:t>26/10</w:t>
+            </w:r>
+            <w:r>
+              <w:rPr>
+                <w:rFonts w:ascii="Times New Roman" w:hAnsi="Times New Roman" w:cs="Times New Roman"/>
+                <w:sz w:val="26"/>
+                <w:szCs w:val="26"/>
+              </w:rPr>
+              <w:t>/2026</w:t>
             </w:r>
           </w:p>
           <w:p>
@@ -20676,15 +22806,15 @@
                 <w:sz w:val="26"/>
                 <w:szCs w:val="26"/>
               </w:rPr>
-              <w:t>../../20</w:t>
-            </w:r>
-            <w:r>
-              <w:rPr>
-                <w:rFonts w:ascii="Times New Roman" w:hAnsi="Times New Roman" w:cs="Times New Roman"/>
-                <w:sz w:val="26"/>
-                <w:szCs w:val="26"/>
-              </w:rPr>
-              <w:t>26</w:t>
+              <w:t>01/11</w:t>
+            </w:r>
+            <w:r>
+              <w:rPr>
+                <w:rFonts w:ascii="Times New Roman" w:hAnsi="Times New Roman" w:cs="Times New Roman"/>
+                <w:sz w:val="26"/>
+                <w:szCs w:val="26"/>
+              </w:rPr>
+              <w:t>/2026</w:t>
             </w:r>
             <w:r>
               <w:rPr>
@@ -22326,15 +24456,23 @@
                 <w:sz w:val="26"/>
                 <w:szCs w:val="26"/>
               </w:rPr>
-              <w:t>:  ../../20</w:t>
-            </w:r>
-            <w:r>
-              <w:rPr>
-                <w:rFonts w:ascii="Times New Roman" w:hAnsi="Times New Roman" w:cs="Times New Roman"/>
-                <w:sz w:val="26"/>
-                <w:szCs w:val="26"/>
-              </w:rPr>
-              <w:t>26</w:t>
+              <w:t xml:space="preserve">:  </w:t>
+            </w:r>
+            <w:r>
+              <w:rPr>
+                <w:rFonts w:ascii="Times New Roman" w:hAnsi="Times New Roman" w:cs="Times New Roman"/>
+                <w:sz w:val="26"/>
+                <w:szCs w:val="26"/>
+              </w:rPr>
+              <w:t>02/11</w:t>
+            </w:r>
+            <w:r>
+              <w:rPr>
+                <w:rFonts w:ascii="Times New Roman" w:hAnsi="Times New Roman" w:cs="Times New Roman"/>
+                <w:sz w:val="26"/>
+                <w:szCs w:val="26"/>
+              </w:rPr>
+              <w:t>/2026</w:t>
             </w:r>
           </w:p>
           <w:p>
@@ -22359,15 +24497,15 @@
                 <w:sz w:val="26"/>
                 <w:szCs w:val="26"/>
               </w:rPr>
-              <w:t>../../20</w:t>
-            </w:r>
-            <w:r>
-              <w:rPr>
-                <w:rFonts w:ascii="Times New Roman" w:hAnsi="Times New Roman" w:cs="Times New Roman"/>
-                <w:sz w:val="26"/>
-                <w:szCs w:val="26"/>
-              </w:rPr>
-              <w:t>26</w:t>
+              <w:t>08/11</w:t>
+            </w:r>
+            <w:r>
+              <w:rPr>
+                <w:rFonts w:ascii="Times New Roman" w:hAnsi="Times New Roman" w:cs="Times New Roman"/>
+                <w:sz w:val="26"/>
+                <w:szCs w:val="26"/>
+              </w:rPr>
+              <w:t>/2026</w:t>
             </w:r>
             <w:r>
               <w:rPr>
@@ -24241,15 +26379,23 @@
                 <w:sz w:val="26"/>
                 <w:szCs w:val="26"/>
               </w:rPr>
-              <w:t>:  ../../20</w:t>
-            </w:r>
-            <w:r>
-              <w:rPr>
-                <w:rFonts w:ascii="Times New Roman" w:hAnsi="Times New Roman" w:cs="Times New Roman"/>
-                <w:sz w:val="26"/>
-                <w:szCs w:val="26"/>
-              </w:rPr>
-              <w:t>26</w:t>
+              <w:t xml:space="preserve">:  </w:t>
+            </w:r>
+            <w:r>
+              <w:rPr>
+                <w:rFonts w:ascii="Times New Roman" w:hAnsi="Times New Roman" w:cs="Times New Roman"/>
+                <w:sz w:val="26"/>
+                <w:szCs w:val="26"/>
+              </w:rPr>
+              <w:t>09/11</w:t>
+            </w:r>
+            <w:r>
+              <w:rPr>
+                <w:rFonts w:ascii="Times New Roman" w:hAnsi="Times New Roman" w:cs="Times New Roman"/>
+                <w:sz w:val="26"/>
+                <w:szCs w:val="26"/>
+              </w:rPr>
+              <w:t>/2026</w:t>
             </w:r>
           </w:p>
           <w:p>
@@ -24274,15 +26420,15 @@
                 <w:sz w:val="26"/>
                 <w:szCs w:val="26"/>
               </w:rPr>
-              <w:t>../../20</w:t>
-            </w:r>
-            <w:r>
-              <w:rPr>
-                <w:rFonts w:ascii="Times New Roman" w:hAnsi="Times New Roman" w:cs="Times New Roman"/>
-                <w:sz w:val="26"/>
-                <w:szCs w:val="26"/>
-              </w:rPr>
-              <w:t>26</w:t>
+              <w:t>15/11</w:t>
+            </w:r>
+            <w:r>
+              <w:rPr>
+                <w:rFonts w:ascii="Times New Roman" w:hAnsi="Times New Roman" w:cs="Times New Roman"/>
+                <w:sz w:val="26"/>
+                <w:szCs w:val="26"/>
+              </w:rPr>
+              <w:t>/2026</w:t>
             </w:r>
             <w:r>
               <w:rPr>
@@ -24885,6 +27031,7 @@
                 <w:sz w:val="26"/>
                 <w:szCs w:val="26"/>
               </w:rPr>
+              <w:lastRenderedPageBreak/>
               <w:t>(Từ</w:t>
             </w:r>
             <w:r>
@@ -24893,15 +27040,23 @@
                 <w:sz w:val="26"/>
                 <w:szCs w:val="26"/>
               </w:rPr>
-              <w:t>:  ../../20</w:t>
-            </w:r>
-            <w:r>
-              <w:rPr>
-                <w:rFonts w:ascii="Times New Roman" w:hAnsi="Times New Roman" w:cs="Times New Roman"/>
-                <w:sz w:val="26"/>
-                <w:szCs w:val="26"/>
-              </w:rPr>
-              <w:t>26</w:t>
+              <w:t xml:space="preserve">:  </w:t>
+            </w:r>
+            <w:r>
+              <w:rPr>
+                <w:rFonts w:ascii="Times New Roman" w:hAnsi="Times New Roman" w:cs="Times New Roman"/>
+                <w:sz w:val="26"/>
+                <w:szCs w:val="26"/>
+              </w:rPr>
+              <w:t>16/11</w:t>
+            </w:r>
+            <w:r>
+              <w:rPr>
+                <w:rFonts w:ascii="Times New Roman" w:hAnsi="Times New Roman" w:cs="Times New Roman"/>
+                <w:sz w:val="26"/>
+                <w:szCs w:val="26"/>
+              </w:rPr>
+              <w:t>/2026</w:t>
             </w:r>
           </w:p>
           <w:p>
@@ -24926,15 +27081,15 @@
                 <w:sz w:val="26"/>
                 <w:szCs w:val="26"/>
               </w:rPr>
-              <w:t>../../20</w:t>
-            </w:r>
-            <w:r>
-              <w:rPr>
-                <w:rFonts w:ascii="Times New Roman" w:hAnsi="Times New Roman" w:cs="Times New Roman"/>
-                <w:sz w:val="26"/>
-                <w:szCs w:val="26"/>
-              </w:rPr>
-              <w:t>26</w:t>
+              <w:t>22/11</w:t>
+            </w:r>
+            <w:r>
+              <w:rPr>
+                <w:rFonts w:ascii="Times New Roman" w:hAnsi="Times New Roman" w:cs="Times New Roman"/>
+                <w:sz w:val="26"/>
+                <w:szCs w:val="26"/>
+              </w:rPr>
+              <w:t>/2026</w:t>
             </w:r>
             <w:r>
               <w:rPr>
@@ -25628,7 +27783,7 @@
 </file>
 
 <file path=word/endnotes.xml><?xml version="1.0" encoding="utf-8"?>
-<w:endnotes xmlns:wpc="http://schemas.microsoft.com/office/word/2010/wordprocessingCanvas" xmlns:cx="http://schemas.microsoft.com/office/drawing/2014/chartex" xmlns:cx1="http://schemas.microsoft.com/office/drawing/2015/9/8/chartex" xmlns:cx2="http://schemas.microsoft.com/office/drawing/2015/10/21/chartex" xmlns:cx3="http://schemas.microsoft.com/office/drawing/2016/5/9/chartex" xmlns:cx4="http://schemas.microsoft.com/office/drawing/2016/5/10/chartex" xmlns:cx5="http://schemas.microsoft.com/office/drawing/2016/5/11/chartex" xmlns:cx6="http://schemas.microsoft.com/office/drawing/2016/5/12/chartex" xmlns:cx7="http://schemas.microsoft.com/office/drawing/2016/5/13/chartex" xmlns:cx8="http://schemas.microsoft.com/office/drawing/2016/5/14/chartex" xmlns:mc="http://schemas.openxmlformats.org/markup-compatibility/2006" xmlns:aink="http://schemas.microsoft.com/office/drawing/2016/ink" xmlns:am3d="http://schemas.microsoft.com/office/drawing/2017/model3d" xmlns:o="urn:schemas-microsoft-com:office:office" xmlns:oel="http://schemas.microsoft.com/office/2019/extlst" xmlns:r="http://schemas.openxmlformats.org/officeDocument/2006/relationships" xmlns:m="http://schemas.openxmlformats.org/officeDocument/2006/math" xmlns:v="urn:schemas-microsoft-com:vml" xmlns:wp14="http://schemas.microsoft.com/office/word/2010/wordprocessingDrawing" xmlns:wp="http://schemas.openxmlformats.org/drawingml/2006/wordprocessingDrawing" xmlns:w10="urn:schemas-microsoft-com:office:word" xmlns:w="http://schemas.openxmlformats.org/wordprocessingml/2006/main" xmlns:w14="http://schemas.microsoft.com/office/word/2010/wordml" xmlns:w15="http://schemas.microsoft.com/office/word/2012/wordml" xmlns:w16cei="http://schemas.microsoft.com/office/word/2026/wordml/cei" xmlns:w16cex="http://schemas.microsoft.com/office/word/2018/wordml/cex" xmlns:w16cid="http://schemas.microsoft.com/office/word/2016/wordml/cid" xmlns:w16="http://schemas.microsoft.com/office/word/2018/wordml" xmlns:w16du="http://schemas.microsoft.com/office/word/2023/wordml/word16du" xmlns:w16sdtdh="http://schemas.microsoft.com/office/word/2020/wordml/sdtdatahash" xmlns:w16sdtfl="http://schemas.microsoft.com/office/word/2024/wordml/sdtformatlock" xmlns:w16se="http://schemas.microsoft.com/office/word/2015/wordml/symex" xmlns:wpg="http://schemas.microsoft.com/office/word/2010/wordprocessingGroup" xmlns:wpi="http://schemas.microsoft.com/office/word/2010/wordprocessingInk" xmlns:wne="http://schemas.microsoft.com/office/word/2006/wordml" xmlns:wps="http://schemas.microsoft.com/office/word/2010/wordprocessingShape" mc:Ignorable="w14 w15 w16se w16cid w16 w16cex w16sdtdh w16sdtfl w16du wp14">
+<w:endnotes xmlns:wpc="http://schemas.microsoft.com/office/word/2010/wordprocessingCanvas" xmlns:cx="http://schemas.microsoft.com/office/drawing/2014/chartex" xmlns:cx1="http://schemas.microsoft.com/office/drawing/2015/9/8/chartex" xmlns:cx2="http://schemas.microsoft.com/office/drawing/2015/10/21/chartex" xmlns:cx3="http://schemas.microsoft.com/office/drawing/2016/5/9/chartex" xmlns:cx4="http://schemas.microsoft.com/office/drawing/2016/5/10/chartex" xmlns:cx5="http://schemas.microsoft.com/office/drawing/2016/5/11/chartex" xmlns:cx6="http://schemas.microsoft.com/office/drawing/2016/5/12/chartex" xmlns:cx7="http://schemas.microsoft.com/office/drawing/2016/5/13/chartex" xmlns:cx8="http://schemas.microsoft.com/office/drawing/2016/5/14/chartex" xmlns:mc="http://schemas.openxmlformats.org/markup-compatibility/2006" xmlns:aink="http://schemas.microsoft.com/office/drawing/2016/ink" xmlns:am3d="http://schemas.microsoft.com/office/drawing/2017/model3d" xmlns:o="urn:schemas-microsoft-com:office:office" xmlns:oel="http://schemas.microsoft.com/office/2019/extlst" xmlns:r="http://schemas.openxmlformats.org/officeDocument/2006/relationships" xmlns:m="http://schemas.openxmlformats.org/officeDocument/2006/math" xmlns:v="urn:schemas-microsoft-com:vml" xmlns:wp14="http://schemas.microsoft.com/office/word/2010/wordprocessingDrawing" xmlns:wp="http://schemas.openxmlformats.org/drawingml/2006/wordprocessingDrawing" xmlns:w10="urn:schemas-microsoft-com:office:word" xmlns:w="http://schemas.openxmlformats.org/wordprocessingml/2006/main" xmlns:w14="http://schemas.microsoft.com/office/word/2010/wordml" xmlns:w15="http://schemas.microsoft.com/office/word/2012/wordml" xmlns:w16cex="http://schemas.microsoft.com/office/word/2018/wordml/cex" xmlns:w16cid="http://schemas.microsoft.com/office/word/2016/wordml/cid" xmlns:w16="http://schemas.microsoft.com/office/word/2018/wordml" xmlns:w16du="http://schemas.microsoft.com/office/word/2023/wordml/word16du" xmlns:w16sdtdh="http://schemas.microsoft.com/office/word/2020/wordml/sdtdatahash" xmlns:w16sdtfl="http://schemas.microsoft.com/office/word/2024/wordml/sdtformatlock" xmlns:w16se="http://schemas.microsoft.com/office/word/2015/wordml/symex" xmlns:wpg="http://schemas.microsoft.com/office/word/2010/wordprocessingGroup" xmlns:wpi="http://schemas.microsoft.com/office/word/2010/wordprocessingInk" xmlns:wne="http://schemas.microsoft.com/office/word/2006/wordml" xmlns:wps="http://schemas.microsoft.com/office/word/2010/wordprocessingShape" mc:Ignorable="w14 w15 w16se w16cid w16 w16cex w16sdtdh w16sdtfl w16du wp14">
   <w:endnote w:type="separator" w:id="-1">
     <w:p>
       <w:pPr>
@@ -25653,7 +27808,7 @@
 </file>
 
 <file path=word/footer1.xml><?xml version="1.0" encoding="utf-8"?>
-<w:ftr xmlns:wpc="http://schemas.microsoft.com/office/word/2010/wordprocessingCanvas" xmlns:cx="http://schemas.microsoft.com/office/drawing/2014/chartex" xmlns:cx1="http://schemas.microsoft.com/office/drawing/2015/9/8/chartex" xmlns:cx2="http://schemas.microsoft.com/office/drawing/2015/10/21/chartex" xmlns:cx3="http://schemas.microsoft.com/office/drawing/2016/5/9/chartex" xmlns:cx4="http://schemas.microsoft.com/office/drawing/2016/5/10/chartex" xmlns:cx5="http://schemas.microsoft.com/office/drawing/2016/5/11/chartex" xmlns:cx6="http://schemas.microsoft.com/office/drawing/2016/5/12/chartex" xmlns:cx7="http://schemas.microsoft.com/office/drawing/2016/5/13/chartex" xmlns:cx8="http://schemas.microsoft.com/office/drawing/2016/5/14/chartex" xmlns:mc="http://schemas.openxmlformats.org/markup-compatibility/2006" xmlns:aink="http://schemas.microsoft.com/office/drawing/2016/ink" xmlns:am3d="http://schemas.microsoft.com/office/drawing/2017/model3d" xmlns:o="urn:schemas-microsoft-com:office:office" xmlns:oel="http://schemas.microsoft.com/office/2019/extlst" xmlns:r="http://schemas.openxmlformats.org/officeDocument/2006/relationships" xmlns:m="http://schemas.openxmlformats.org/officeDocument/2006/math" xmlns:v="urn:schemas-microsoft-com:vml" xmlns:wp14="http://schemas.microsoft.com/office/word/2010/wordprocessingDrawing" xmlns:wp="http://schemas.openxmlformats.org/drawingml/2006/wordprocessingDrawing" xmlns:w10="urn:schemas-microsoft-com:office:word" xmlns:w="http://schemas.openxmlformats.org/wordprocessingml/2006/main" xmlns:w14="http://schemas.microsoft.com/office/word/2010/wordml" xmlns:w15="http://schemas.microsoft.com/office/word/2012/wordml" xmlns:w16cei="http://schemas.microsoft.com/office/word/2026/wordml/cei" xmlns:w16cex="http://schemas.microsoft.com/office/word/2018/wordml/cex" xmlns:w16cid="http://schemas.microsoft.com/office/word/2016/wordml/cid" xmlns:w16="http://schemas.microsoft.com/office/word/2018/wordml" xmlns:w16du="http://schemas.microsoft.com/office/word/2023/wordml/word16du" xmlns:w16sdtdh="http://schemas.microsoft.com/office/word/2020/wordml/sdtdatahash" xmlns:w16sdtfl="http://schemas.microsoft.com/office/word/2024/wordml/sdtformatlock" xmlns:w16se="http://schemas.microsoft.com/office/word/2015/wordml/symex" xmlns:wpg="http://schemas.microsoft.com/office/word/2010/wordprocessingGroup" xmlns:wpi="http://schemas.microsoft.com/office/word/2010/wordprocessingInk" xmlns:wne="http://schemas.microsoft.com/office/word/2006/wordml" xmlns:wps="http://schemas.microsoft.com/office/word/2010/wordprocessingShape" mc:Ignorable="w14 w15 w16se w16cid w16 w16cex w16sdtdh w16sdtfl w16du wp14">
+<w:ftr xmlns:wpc="http://schemas.microsoft.com/office/word/2010/wordprocessingCanvas" xmlns:cx="http://schemas.microsoft.com/office/drawing/2014/chartex" xmlns:cx1="http://schemas.microsoft.com/office/drawing/2015/9/8/chartex" xmlns:cx2="http://schemas.microsoft.com/office/drawing/2015/10/21/chartex" xmlns:cx3="http://schemas.microsoft.com/office/drawing/2016/5/9/chartex" xmlns:cx4="http://schemas.microsoft.com/office/drawing/2016/5/10/chartex" xmlns:cx5="http://schemas.microsoft.com/office/drawing/2016/5/11/chartex" xmlns:cx6="http://schemas.microsoft.com/office/drawing/2016/5/12/chartex" xmlns:cx7="http://schemas.microsoft.com/office/drawing/2016/5/13/chartex" xmlns:cx8="http://schemas.microsoft.com/office/drawing/2016/5/14/chartex" xmlns:mc="http://schemas.openxmlformats.org/markup-compatibility/2006" xmlns:aink="http://schemas.microsoft.com/office/drawing/2016/ink" xmlns:am3d="http://schemas.microsoft.com/office/drawing/2017/model3d" xmlns:o="urn:schemas-microsoft-com:office:office" xmlns:oel="http://schemas.microsoft.com/office/2019/extlst" xmlns:r="http://schemas.openxmlformats.org/officeDocument/2006/relationships" xmlns:m="http://schemas.openxmlformats.org/officeDocument/2006/math" xmlns:v="urn:schemas-microsoft-com:vml" xmlns:wp14="http://schemas.microsoft.com/office/word/2010/wordprocessingDrawing" xmlns:wp="http://schemas.openxmlformats.org/drawingml/2006/wordprocessingDrawing" xmlns:w10="urn:schemas-microsoft-com:office:word" xmlns:w="http://schemas.openxmlformats.org/wordprocessingml/2006/main" xmlns:w14="http://schemas.microsoft.com/office/word/2010/wordml" xmlns:w15="http://schemas.microsoft.com/office/word/2012/wordml" xmlns:w16cex="http://schemas.microsoft.com/office/word/2018/wordml/cex" xmlns:w16cid="http://schemas.microsoft.com/office/word/2016/wordml/cid" xmlns:w16="http://schemas.microsoft.com/office/word/2018/wordml" xmlns:w16du="http://schemas.microsoft.com/office/word/2023/wordml/word16du" xmlns:w16sdtdh="http://schemas.microsoft.com/office/word/2020/wordml/sdtdatahash" xmlns:w16sdtfl="http://schemas.microsoft.com/office/word/2024/wordml/sdtformatlock" xmlns:w16se="http://schemas.microsoft.com/office/word/2015/wordml/symex" xmlns:wpg="http://schemas.microsoft.com/office/word/2010/wordprocessingGroup" xmlns:wpi="http://schemas.microsoft.com/office/word/2010/wordprocessingInk" xmlns:wne="http://schemas.microsoft.com/office/word/2006/wordml" xmlns:wps="http://schemas.microsoft.com/office/word/2010/wordprocessingShape" mc:Ignorable="w14 w15 w16se w16cid w16 w16cex w16sdtdh w16sdtfl w16du wp14">
   <w:sdt>
     <w:sdtPr>
       <w:rPr>
@@ -25745,7 +27900,7 @@
                 </wp:anchor>
               </w:drawing>
             </mc:Choice>
-            <mc:Fallback>
+            <mc:Fallback xmlns:w16cei="http://schemas.microsoft.com/office/word/2026/wordml/cei">
               <w:pict>
                 <v:line w14:anchorId="7AE9D890" id="Straight Connector 1" o:spid="_x0000_s1026" style="position:absolute;z-index:251659264;visibility:visible;mso-wrap-style:square;mso-width-percent:0;mso-wrap-distance-left:9pt;mso-wrap-distance-top:0;mso-wrap-distance-right:9pt;mso-wrap-distance-bottom:0;mso-position-horizontal:absolute;mso-position-horizontal-relative:text;mso-position-vertical:absolute;mso-position-vertical-relative:text;mso-width-percent:0;mso-width-relative:margin" from=".85pt,.5pt" to="525.25pt,.5pt" o:gfxdata="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" strokecolor="black [3200]" strokeweight=".5pt">
                   <v:stroke joinstyle="miter"/>
@@ -25932,7 +28087,7 @@
 </file>
 
 <file path=word/footnotes.xml><?xml version="1.0" encoding="utf-8"?>
-<w:footnotes xmlns:wpc="http://schemas.microsoft.com/office/word/2010/wordprocessingCanvas" xmlns:cx="http://schemas.microsoft.com/office/drawing/2014/chartex" xmlns:cx1="http://schemas.microsoft.com/office/drawing/2015/9/8/chartex" xmlns:cx2="http://schemas.microsoft.com/office/drawing/2015/10/21/chartex" xmlns:cx3="http://schemas.microsoft.com/office/drawing/2016/5/9/chartex" xmlns:cx4="http://schemas.microsoft.com/office/drawing/2016/5/10/chartex" xmlns:cx5="http://schemas.microsoft.com/office/drawing/2016/5/11/chartex" xmlns:cx6="http://schemas.microsoft.com/office/drawing/2016/5/12/chartex" xmlns:cx7="http://schemas.microsoft.com/office/drawing/2016/5/13/chartex" xmlns:cx8="http://schemas.microsoft.com/office/drawing/2016/5/14/chartex" xmlns:mc="http://schemas.openxmlformats.org/markup-compatibility/2006" xmlns:aink="http://schemas.microsoft.com/office/drawing/2016/ink" xmlns:am3d="http://schemas.microsoft.com/office/drawing/2017/model3d" xmlns:o="urn:schemas-microsoft-com:office:office" xmlns:oel="http://schemas.microsoft.com/office/2019/extlst" xmlns:r="http://schemas.openxmlformats.org/officeDocument/2006/relationships" xmlns:m="http://schemas.openxmlformats.org/officeDocument/2006/math" xmlns:v="urn:schemas-microsoft-com:vml" xmlns:wp14="http://schemas.microsoft.com/office/word/2010/wordprocessingDrawing" xmlns:wp="http://schemas.openxmlformats.org/drawingml/2006/wordprocessingDrawing" xmlns:w10="urn:schemas-microsoft-com:office:word" xmlns:w="http://schemas.openxmlformats.org/wordprocessingml/2006/main" xmlns:w14="http://schemas.microsoft.com/office/word/2010/wordml" xmlns:w15="http://schemas.microsoft.com/office/word/2012/wordml" xmlns:w16cei="http://schemas.microsoft.com/office/word/2026/wordml/cei" xmlns:w16cex="http://schemas.microsoft.com/office/word/2018/wordml/cex" xmlns:w16cid="http://schemas.microsoft.com/office/word/2016/wordml/cid" xmlns:w16="http://schemas.microsoft.com/office/word/2018/wordml" xmlns:w16du="http://schemas.microsoft.com/office/word/2023/wordml/word16du" xmlns:w16sdtdh="http://schemas.microsoft.com/office/word/2020/wordml/sdtdatahash" xmlns:w16sdtfl="http://schemas.microsoft.com/office/word/2024/wordml/sdtformatlock" xmlns:w16se="http://schemas.microsoft.com/office/word/2015/wordml/symex" xmlns:wpg="http://schemas.microsoft.com/office/word/2010/wordprocessingGroup" xmlns:wpi="http://schemas.microsoft.com/office/word/2010/wordprocessingInk" xmlns:wne="http://schemas.microsoft.com/office/word/2006/wordml" xmlns:wps="http://schemas.microsoft.com/office/word/2010/wordprocessingShape" mc:Ignorable="w14 w15 w16se w16cid w16 w16cex w16sdtdh w16sdtfl w16du wp14">
+<w:footnotes xmlns:wpc="http://schemas.microsoft.com/office/word/2010/wordprocessingCanvas" xmlns:cx="http://schemas.microsoft.com/office/drawing/2014/chartex" xmlns:cx1="http://schemas.microsoft.com/office/drawing/2015/9/8/chartex" xmlns:cx2="http://schemas.microsoft.com/office/drawing/2015/10/21/chartex" xmlns:cx3="http://schemas.microsoft.com/office/drawing/2016/5/9/chartex" xmlns:cx4="http://schemas.microsoft.com/office/drawing/2016/5/10/chartex" xmlns:cx5="http://schemas.microsoft.com/office/drawing/2016/5/11/chartex" xmlns:cx6="http://schemas.microsoft.com/office/drawing/2016/5/12/chartex" xmlns:cx7="http://schemas.microsoft.com/office/drawing/2016/5/13/chartex" xmlns:cx8="http://schemas.microsoft.com/office/drawing/2016/5/14/chartex" xmlns:mc="http://schemas.openxmlformats.org/markup-compatibility/2006" xmlns:aink="http://schemas.microsoft.com/office/drawing/2016/ink" xmlns:am3d="http://schemas.microsoft.com/office/drawing/2017/model3d" xmlns:o="urn:schemas-microsoft-com:office:office" xmlns:oel="http://schemas.microsoft.com/office/2019/extlst" xmlns:r="http://schemas.openxmlformats.org/officeDocument/2006/relationships" xmlns:m="http://schemas.openxmlformats.org/officeDocument/2006/math" xmlns:v="urn:schemas-microsoft-com:vml" xmlns:wp14="http://schemas.microsoft.com/office/word/2010/wordprocessingDrawing" xmlns:wp="http://schemas.openxmlformats.org/drawingml/2006/wordprocessingDrawing" xmlns:w10="urn:schemas-microsoft-com:office:word" xmlns:w="http://schemas.openxmlformats.org/wordprocessingml/2006/main" xmlns:w14="http://schemas.microsoft.com/office/word/2010/wordml" xmlns:w15="http://schemas.microsoft.com/office/word/2012/wordml" xmlns:w16cex="http://schemas.microsoft.com/office/word/2018/wordml/cex" xmlns:w16cid="http://schemas.microsoft.com/office/word/2016/wordml/cid" xmlns:w16="http://schemas.microsoft.com/office/word/2018/wordml" xmlns:w16du="http://schemas.microsoft.com/office/word/2023/wordml/word16du" xmlns:w16sdtdh="http://schemas.microsoft.com/office/word/2020/wordml/sdtdatahash" xmlns:w16sdtfl="http://schemas.microsoft.com/office/word/2024/wordml/sdtformatlock" xmlns:w16se="http://schemas.microsoft.com/office/word/2015/wordml/symex" xmlns:wpg="http://schemas.microsoft.com/office/word/2010/wordprocessingGroup" xmlns:wpi="http://schemas.microsoft.com/office/word/2010/wordprocessingInk" xmlns:wne="http://schemas.microsoft.com/office/word/2006/wordml" xmlns:wps="http://schemas.microsoft.com/office/word/2010/wordprocessingShape" mc:Ignorable="w14 w15 w16se w16cid w16 w16cex w16sdtdh w16sdtfl w16du wp14">
   <w:footnote w:type="separator" w:id="-1">
     <w:p>
       <w:pPr>
@@ -25957,7 +28112,7 @@
 </file>
 
 <file path=word/numbering.xml><?xml version="1.0" encoding="utf-8"?>
-<w:numbering xmlns:wpc="http://schemas.microsoft.com/office/word/2010/wordprocessingCanvas" xmlns:cx="http://schemas.microsoft.com/office/drawing/2014/chartex" xmlns:cx1="http://schemas.microsoft.com/office/drawing/2015/9/8/chartex" xmlns:cx2="http://schemas.microsoft.com/office/drawing/2015/10/21/chartex" xmlns:cx3="http://schemas.microsoft.com/office/drawing/2016/5/9/chartex" xmlns:cx4="http://schemas.microsoft.com/office/drawing/2016/5/10/chartex" xmlns:cx5="http://schemas.microsoft.com/office/drawing/2016/5/11/chartex" xmlns:cx6="http://schemas.microsoft.com/office/drawing/2016/5/12/chartex" xmlns:cx7="http://schemas.microsoft.com/office/drawing/2016/5/13/chartex" xmlns:cx8="http://schemas.microsoft.com/office/drawing/2016/5/14/chartex" xmlns:mc="http://schemas.openxmlformats.org/markup-compatibility/2006" xmlns:aink="http://schemas.microsoft.com/office/drawing/2016/ink" xmlns:am3d="http://schemas.microsoft.com/office/drawing/2017/model3d" xmlns:o="urn:schemas-microsoft-com:office:office" xmlns:oel="http://schemas.microsoft.com/office/2019/extlst" xmlns:r="http://schemas.openxmlformats.org/officeDocument/2006/relationships" xmlns:m="http://schemas.openxmlformats.org/officeDocument/2006/math" xmlns:v="urn:schemas-microsoft-com:vml" xmlns:wp14="http://schemas.microsoft.com/office/word/2010/wordprocessingDrawing" xmlns:wp="http://schemas.openxmlformats.org/drawingml/2006/wordprocessingDrawing" xmlns:w10="urn:schemas-microsoft-com:office:word" xmlns:w="http://schemas.openxmlformats.org/wordprocessingml/2006/main" xmlns:w14="http://schemas.microsoft.com/office/word/2010/wordml" xmlns:w15="http://schemas.microsoft.com/office/word/2012/wordml" xmlns:w16cei="http://schemas.microsoft.com/office/word/2026/wordml/cei" xmlns:w16cex="http://schemas.microsoft.com/office/word/2018/wordml/cex" xmlns:w16cid="http://schemas.microsoft.com/office/word/2016/wordml/cid" xmlns:w16="http://schemas.microsoft.com/office/word/2018/wordml" xmlns:w16du="http://schemas.microsoft.com/office/word/2023/wordml/word16du" xmlns:w16sdtdh="http://schemas.microsoft.com/office/word/2020/wordml/sdtdatahash" xmlns:w16sdtfl="http://schemas.microsoft.com/office/word/2024/wordml/sdtformatlock" xmlns:w16se="http://schemas.microsoft.com/office/word/2015/wordml/symex" xmlns:wpg="http://schemas.microsoft.com/office/word/2010/wordprocessingGroup" xmlns:wpi="http://schemas.microsoft.com/office/word/2010/wordprocessingInk" xmlns:wne="http://schemas.microsoft.com/office/word/2006/wordml" xmlns:wps="http://schemas.microsoft.com/office/word/2010/wordprocessingShape" mc:Ignorable="w14 w15 w16se w16cid w16 w16cex w16sdtdh w16sdtfl w16du wp14">
+<w:numbering xmlns:wpc="http://schemas.microsoft.com/office/word/2010/wordprocessingCanvas" xmlns:cx="http://schemas.microsoft.com/office/drawing/2014/chartex" xmlns:cx1="http://schemas.microsoft.com/office/drawing/2015/9/8/chartex" xmlns:cx2="http://schemas.microsoft.com/office/drawing/2015/10/21/chartex" xmlns:cx3="http://schemas.microsoft.com/office/drawing/2016/5/9/chartex" xmlns:cx4="http://schemas.microsoft.com/office/drawing/2016/5/10/chartex" xmlns:cx5="http://schemas.microsoft.com/office/drawing/2016/5/11/chartex" xmlns:cx6="http://schemas.microsoft.com/office/drawing/2016/5/12/chartex" xmlns:cx7="http://schemas.microsoft.com/office/drawing/2016/5/13/chartex" xmlns:cx8="http://schemas.microsoft.com/office/drawing/2016/5/14/chartex" xmlns:mc="http://schemas.openxmlformats.org/markup-compatibility/2006" xmlns:aink="http://schemas.microsoft.com/office/drawing/2016/ink" xmlns:am3d="http://schemas.microsoft.com/office/drawing/2017/model3d" xmlns:o="urn:schemas-microsoft-com:office:office" xmlns:oel="http://schemas.microsoft.com/office/2019/extlst" xmlns:r="http://schemas.openxmlformats.org/officeDocument/2006/relationships" xmlns:m="http://schemas.openxmlformats.org/officeDocument/2006/math" xmlns:v="urn:schemas-microsoft-com:vml" xmlns:wp14="http://schemas.microsoft.com/office/word/2010/wordprocessingDrawing" xmlns:wp="http://schemas.openxmlformats.org/drawingml/2006/wordprocessingDrawing" xmlns:w10="urn:schemas-microsoft-com:office:word" xmlns:w="http://schemas.openxmlformats.org/wordprocessingml/2006/main" xmlns:w14="http://schemas.microsoft.com/office/word/2010/wordml" xmlns:w15="http://schemas.microsoft.com/office/word/2012/wordml" xmlns:w16cex="http://schemas.microsoft.com/office/word/2018/wordml/cex" xmlns:w16cid="http://schemas.microsoft.com/office/word/2016/wordml/cid" xmlns:w16="http://schemas.microsoft.com/office/word/2018/wordml" xmlns:w16du="http://schemas.microsoft.com/office/word/2023/wordml/word16du" xmlns:w16sdtdh="http://schemas.microsoft.com/office/word/2020/wordml/sdtdatahash" xmlns:w16sdtfl="http://schemas.microsoft.com/office/word/2024/wordml/sdtformatlock" xmlns:w16se="http://schemas.microsoft.com/office/word/2015/wordml/symex" xmlns:wpg="http://schemas.microsoft.com/office/word/2010/wordprocessingGroup" xmlns:wpi="http://schemas.microsoft.com/office/word/2010/wordprocessingInk" xmlns:wne="http://schemas.microsoft.com/office/word/2006/wordml" xmlns:wps="http://schemas.microsoft.com/office/word/2010/wordprocessingShape" mc:Ignorable="w14 w15 w16se w16cid w16 w16cex w16sdtdh w16sdtfl w16du wp14">
   <w:abstractNum w:abstractNumId="0" w15:restartNumberingAfterBreak="0">
     <w:nsid w:val="79BF5A33"/>
     <w:multiLevelType w:val="hybridMultilevel"/>
@@ -26456,7 +28611,6 @@
   <w:style w:type="character" w:default="1" w:styleId="DefaultParagraphFont">
     <w:name w:val="Default Paragraph Font"/>
     <w:uiPriority w:val="1"/>
-    <w:semiHidden/>
     <w:unhideWhenUsed/>
   </w:style>
   <w:style w:type="table" w:default="1" w:styleId="TableNormal">

</xml_diff>